<commit_message>
Fix screenshot sizing so each screen section fits on one page
Screenshots capped at 9cm height (phone portrait aspect ratio would
otherwise overflow the page). Diagrams set to full 16cm content width.
H3 headers also trigger page breaks so each screen starts fresh.

Co-Authored-By: Claude Sonnet 4.6 (1M context) <noreply@anthropic.com>
</commit_message>
<xml_diff>
--- a/docs/screens-and-architecture-he.docx
+++ b/docs/screens-and-architecture-he.docx
@@ -316,6 +316,18 @@
         <w:t xml:space="preserve">1. תכנון ותיעוד מסכי הפרויקט</w:t>
       </w:r>
     </w:p>
+    <w:p>
+      <w:pPr>
+        <w:bidi w:val="1"/>
+        <w:jc w:val="right"/>
+      </w:pPr>
+      <w:r>
+        <w:rPr>
+          <w:rtl w:val="1"/>
+        </w:rPr>
+        <w:br w:type="page"/>
+      </w:r>
+    </w:p>
     <w:bookmarkStart w:id="81" w:name="מסך-פתיחה-mainactivity"/>
     <w:p>
       <w:pPr>
@@ -476,6 +488,18 @@
         </w:pict>
       </w:r>
     </w:p>
+    <w:p>
+      <w:pPr>
+        <w:bidi w:val="1"/>
+        <w:jc w:val="right"/>
+      </w:pPr>
+      <w:r>
+        <w:rPr>
+          <w:rtl w:val="1"/>
+        </w:rPr>
+        <w:br w:type="page"/>
+      </w:r>
+    </w:p>
     <w:bookmarkEnd w:id="81"/>
     <w:bookmarkStart w:id="85" w:name="מסך-התחברות-loginactivity"/>
     <w:p>
@@ -503,7 +527,7 @@
         </w:rPr>
         <w:drawing>
           <wp:inline>
-            <wp:extent cx="2667000" cy="5778500"/>
+            <wp:extent cx="1495384" cy="3239999"/>
             <wp:effectExtent b="0" l="0" r="0" t="0"/>
             <wp:docPr descr="מסך התחברות" title="" id="83" name="Picture"/>
             <a:graphic>
@@ -524,7 +548,7 @@
                   <pic:spPr bwMode="auto">
                     <a:xfrm>
                       <a:off x="0" y="0"/>
-                      <a:ext cx="2667000" cy="5778500"/>
+                      <a:ext cx="1495384" cy="3239999"/>
                     </a:xfrm>
                     <a:prstGeom prst="rect">
                       <a:avLst/>
@@ -947,6 +971,18 @@
         </w:pict>
       </w:r>
     </w:p>
+    <w:p>
+      <w:pPr>
+        <w:bidi w:val="1"/>
+        <w:jc w:val="right"/>
+      </w:pPr>
+      <w:r>
+        <w:rPr>
+          <w:rtl w:val="1"/>
+        </w:rPr>
+        <w:br w:type="page"/>
+      </w:r>
+    </w:p>
     <w:bookmarkEnd w:id="85"/>
     <w:bookmarkStart w:id="89" w:name="מסך-הרשמה-registeractivity"/>
     <w:p>
@@ -974,7 +1010,7 @@
         </w:rPr>
         <w:drawing>
           <wp:inline>
-            <wp:extent cx="2667000" cy="5778500"/>
+            <wp:extent cx="1495384" cy="3239999"/>
             <wp:effectExtent b="0" l="0" r="0" t="0"/>
             <wp:docPr descr="מסך הרשמה" title="" id="87" name="Picture"/>
             <a:graphic>
@@ -995,7 +1031,7 @@
                   <pic:spPr bwMode="auto">
                     <a:xfrm>
                       <a:off x="0" y="0"/>
-                      <a:ext cx="2667000" cy="5778500"/>
+                      <a:ext cx="1495384" cy="3239999"/>
                     </a:xfrm>
                     <a:prstGeom prst="rect">
                       <a:avLst/>
@@ -1431,6 +1467,18 @@
         </w:pict>
       </w:r>
     </w:p>
+    <w:p>
+      <w:pPr>
+        <w:bidi w:val="1"/>
+        <w:jc w:val="right"/>
+      </w:pPr>
+      <w:r>
+        <w:rPr>
+          <w:rtl w:val="1"/>
+        </w:rPr>
+        <w:br w:type="page"/>
+      </w:r>
+    </w:p>
     <w:bookmarkEnd w:id="89"/>
     <w:bookmarkStart w:id="93" w:name="מסך-בית-לתלמיד-studenthomeactivity"/>
     <w:p>
@@ -1458,7 +1506,7 @@
         </w:rPr>
         <w:drawing>
           <wp:inline>
-            <wp:extent cx="2667000" cy="5778500"/>
+            <wp:extent cx="1495384" cy="3239999"/>
             <wp:effectExtent b="0" l="0" r="0" t="0"/>
             <wp:docPr descr="מסך בית לתלמיד" title="" id="91" name="Picture"/>
             <a:graphic>
@@ -1479,7 +1527,7 @@
                   <pic:spPr bwMode="auto">
                     <a:xfrm>
                       <a:off x="0" y="0"/>
-                      <a:ext cx="2667000" cy="5778500"/>
+                      <a:ext cx="1495384" cy="3239999"/>
                     </a:xfrm>
                     <a:prstGeom prst="rect">
                       <a:avLst/>
@@ -1912,6 +1960,18 @@
         </w:pict>
       </w:r>
     </w:p>
+    <w:p>
+      <w:pPr>
+        <w:bidi w:val="1"/>
+        <w:jc w:val="right"/>
+      </w:pPr>
+      <w:r>
+        <w:rPr>
+          <w:rtl w:val="1"/>
+        </w:rPr>
+        <w:br w:type="page"/>
+      </w:r>
+    </w:p>
     <w:bookmarkEnd w:id="93"/>
     <w:bookmarkStart w:id="100" w:name="מסך-בית-למורה-teacherhomeactivity"/>
     <w:p>
@@ -1939,7 +1999,7 @@
         </w:rPr>
         <w:drawing>
           <wp:inline>
-            <wp:extent cx="2667000" cy="5778500"/>
+            <wp:extent cx="1495384" cy="3239999"/>
             <wp:effectExtent b="0" l="0" r="0" t="0"/>
             <wp:docPr descr="מסך בית למורה" title="" id="95" name="Picture"/>
             <a:graphic>
@@ -1960,7 +2020,7 @@
                   <pic:spPr bwMode="auto">
                     <a:xfrm>
                       <a:off x="0" y="0"/>
-                      <a:ext cx="2667000" cy="5778500"/>
+                      <a:ext cx="1495384" cy="3239999"/>
                     </a:xfrm>
                     <a:prstGeom prst="rect">
                       <a:avLst/>
@@ -2432,7 +2492,7 @@
         </w:rPr>
         <w:drawing>
           <wp:inline>
-            <wp:extent cx="2667000" cy="5778500"/>
+            <wp:extent cx="1495384" cy="3239999"/>
             <wp:effectExtent b="0" l="0" r="0" t="0"/>
             <wp:docPr descr="דיאלוג הגדרות מבחן" title="" id="98" name="Picture"/>
             <a:graphic>
@@ -2453,7 +2513,7 @@
                   <pic:spPr bwMode="auto">
                     <a:xfrm>
                       <a:off x="0" y="0"/>
-                      <a:ext cx="2667000" cy="5778500"/>
+                      <a:ext cx="1495384" cy="3239999"/>
                     </a:xfrm>
                     <a:prstGeom prst="rect">
                       <a:avLst/>
@@ -2536,6 +2596,18 @@
         </w:pict>
       </w:r>
     </w:p>
+    <w:p>
+      <w:pPr>
+        <w:bidi w:val="1"/>
+        <w:jc w:val="right"/>
+      </w:pPr>
+      <w:r>
+        <w:rPr>
+          <w:rtl w:val="1"/>
+        </w:rPr>
+        <w:br w:type="page"/>
+      </w:r>
+    </w:p>
     <w:bookmarkEnd w:id="100"/>
     <w:bookmarkStart w:id="104" w:name="Xfb5b4e5e3024e021bd29d089d3a366bbe28eded"/>
     <w:p>
@@ -2563,7 +2635,7 @@
         </w:rPr>
         <w:drawing>
           <wp:inline>
-            <wp:extent cx="2667000" cy="5778500"/>
+            <wp:extent cx="1495384" cy="3239999"/>
             <wp:effectExtent b="0" l="0" r="0" t="0"/>
             <wp:docPr descr="מסך סימולציית פיזיקה" title="" id="102" name="Picture"/>
             <a:graphic>
@@ -2584,7 +2656,7 @@
                   <pic:spPr bwMode="auto">
                     <a:xfrm>
                       <a:off x="0" y="0"/>
-                      <a:ext cx="2667000" cy="5778500"/>
+                      <a:ext cx="1495384" cy="3239999"/>
                     </a:xfrm>
                     <a:prstGeom prst="rect">
                       <a:avLst/>
@@ -3192,6 +3264,18 @@
         </w:pict>
       </w:r>
     </w:p>
+    <w:p>
+      <w:pPr>
+        <w:bidi w:val="1"/>
+        <w:jc w:val="right"/>
+      </w:pPr>
+      <w:r>
+        <w:rPr>
+          <w:rtl w:val="1"/>
+        </w:rPr>
+        <w:br w:type="page"/>
+      </w:r>
+    </w:p>
     <w:bookmarkEnd w:id="104"/>
     <w:bookmarkStart w:id="108" w:name="מסך-מבחן-quizactivity"/>
     <w:p>
@@ -3219,7 +3303,7 @@
         </w:rPr>
         <w:drawing>
           <wp:inline>
-            <wp:extent cx="2667000" cy="5778500"/>
+            <wp:extent cx="1495384" cy="3239999"/>
             <wp:effectExtent b="0" l="0" r="0" t="0"/>
             <wp:docPr descr="מסך מבחן" title="" id="106" name="Picture"/>
             <a:graphic>
@@ -3240,7 +3324,7 @@
                   <pic:spPr bwMode="auto">
                     <a:xfrm>
                       <a:off x="0" y="0"/>
-                      <a:ext cx="2667000" cy="5778500"/>
+                      <a:ext cx="1495384" cy="3239999"/>
                     </a:xfrm>
                     <a:prstGeom prst="rect">
                       <a:avLst/>
@@ -3823,6 +3907,18 @@
         </w:pict>
       </w:r>
     </w:p>
+    <w:p>
+      <w:pPr>
+        <w:bidi w:val="1"/>
+        <w:jc w:val="right"/>
+      </w:pPr>
+      <w:r>
+        <w:rPr>
+          <w:rtl w:val="1"/>
+        </w:rPr>
+        <w:br w:type="page"/>
+      </w:r>
+    </w:p>
     <w:bookmarkEnd w:id="108"/>
     <w:bookmarkStart w:id="112" w:name="מסך-ציונים-gradesactivity"/>
     <w:p>
@@ -3850,7 +3946,7 @@
         </w:rPr>
         <w:drawing>
           <wp:inline>
-            <wp:extent cx="2667000" cy="5778500"/>
+            <wp:extent cx="1495384" cy="3239999"/>
             <wp:effectExtent b="0" l="0" r="0" t="0"/>
             <wp:docPr descr="מסך ציונים" title="" id="110" name="Picture"/>
             <a:graphic>
@@ -3871,7 +3967,7 @@
                   <pic:spPr bwMode="auto">
                     <a:xfrm>
                       <a:off x="0" y="0"/>
-                      <a:ext cx="2667000" cy="5778500"/>
+                      <a:ext cx="1495384" cy="3239999"/>
                     </a:xfrm>
                     <a:prstGeom prst="rect">
                       <a:avLst/>
@@ -4222,6 +4318,18 @@
         </w:pict>
       </w:r>
     </w:p>
+    <w:p>
+      <w:pPr>
+        <w:bidi w:val="1"/>
+        <w:jc w:val="right"/>
+      </w:pPr>
+      <w:r>
+        <w:rPr>
+          <w:rtl w:val="1"/>
+        </w:rPr>
+        <w:br w:type="page"/>
+      </w:r>
+    </w:p>
     <w:bookmarkEnd w:id="112"/>
     <w:bookmarkStart w:id="116" w:name="מסך-יצירת-שאלה-createquestionactivity"/>
     <w:p>
@@ -4249,7 +4357,7 @@
         </w:rPr>
         <w:drawing>
           <wp:inline>
-            <wp:extent cx="2667000" cy="5778500"/>
+            <wp:extent cx="1495384" cy="3239999"/>
             <wp:effectExtent b="0" l="0" r="0" t="0"/>
             <wp:docPr descr="מסך יצירת שאלה" title="" id="114" name="Picture"/>
             <a:graphic>
@@ -4270,7 +4378,7 @@
                   <pic:spPr bwMode="auto">
                     <a:xfrm>
                       <a:off x="0" y="0"/>
-                      <a:ext cx="2667000" cy="5778500"/>
+                      <a:ext cx="1495384" cy="3239999"/>
                     </a:xfrm>
                     <a:prstGeom prst="rect">
                       <a:avLst/>
@@ -4768,6 +4876,18 @@
         </w:pict>
       </w:r>
     </w:p>
+    <w:p>
+      <w:pPr>
+        <w:bidi w:val="1"/>
+        <w:jc w:val="right"/>
+      </w:pPr>
+      <w:r>
+        <w:rPr>
+          <w:rtl w:val="1"/>
+        </w:rPr>
+        <w:br w:type="page"/>
+      </w:r>
+    </w:p>
     <w:bookmarkEnd w:id="116"/>
     <w:bookmarkStart w:id="120" w:name="מסך-מאגר-השאלות-viewquestionsactivity"/>
     <w:p>
@@ -4795,7 +4915,7 @@
         </w:rPr>
         <w:drawing>
           <wp:inline>
-            <wp:extent cx="2667000" cy="5778500"/>
+            <wp:extent cx="1495384" cy="3239999"/>
             <wp:effectExtent b="0" l="0" r="0" t="0"/>
             <wp:docPr descr="מסך מאגר השאלות" title="" id="118" name="Picture"/>
             <a:graphic>
@@ -4816,7 +4936,7 @@
                   <pic:spPr bwMode="auto">
                     <a:xfrm>
                       <a:off x="0" y="0"/>
-                      <a:ext cx="2667000" cy="5778500"/>
+                      <a:ext cx="1495384" cy="3239999"/>
                     </a:xfrm>
                     <a:prstGeom prst="rect">
                       <a:avLst/>
@@ -5167,6 +5287,18 @@
         </w:pict>
       </w:r>
     </w:p>
+    <w:p>
+      <w:pPr>
+        <w:bidi w:val="1"/>
+        <w:jc w:val="right"/>
+      </w:pPr>
+      <w:r>
+        <w:rPr>
+          <w:rtl w:val="1"/>
+        </w:rPr>
+        <w:br w:type="page"/>
+      </w:r>
+    </w:p>
     <w:bookmarkEnd w:id="120"/>
     <w:bookmarkStart w:id="124" w:name="מסך-ציוני-כל-התלמידים-allgradesactivity"/>
     <w:p>
@@ -5194,7 +5326,7 @@
         </w:rPr>
         <w:drawing>
           <wp:inline>
-            <wp:extent cx="2667000" cy="5778500"/>
+            <wp:extent cx="1495384" cy="3239999"/>
             <wp:effectExtent b="0" l="0" r="0" t="0"/>
             <wp:docPr descr="מסך ציוני כל התלמידים" title="" id="122" name="Picture"/>
             <a:graphic>
@@ -5215,7 +5347,7 @@
                   <pic:spPr bwMode="auto">
                     <a:xfrm>
                       <a:off x="0" y="0"/>
-                      <a:ext cx="2667000" cy="5778500"/>
+                      <a:ext cx="1495384" cy="3239999"/>
                     </a:xfrm>
                     <a:prstGeom prst="rect">
                       <a:avLst/>
@@ -5516,6 +5648,18 @@
         </w:pict>
       </w:r>
     </w:p>
+    <w:p>
+      <w:pPr>
+        <w:bidi w:val="1"/>
+        <w:jc w:val="right"/>
+      </w:pPr>
+      <w:r>
+        <w:rPr>
+          <w:rtl w:val="1"/>
+        </w:rPr>
+        <w:br w:type="page"/>
+      </w:r>
+    </w:p>
     <w:bookmarkEnd w:id="124"/>
     <w:bookmarkStart w:id="128" w:name="X85c07889bf1345c51055624a495d27f3e2e93eb"/>
     <w:p>
@@ -5543,7 +5687,7 @@
         </w:rPr>
         <w:drawing>
           <wp:inline>
-            <wp:extent cx="2667000" cy="5778500"/>
+            <wp:extent cx="1495384" cy="3239999"/>
             <wp:effectExtent b="0" l="0" r="0" t="0"/>
             <wp:docPr descr="מסך הגדרות התראות" title="" id="126" name="Picture"/>
             <a:graphic>
@@ -5564,7 +5708,7 @@
                   <pic:spPr bwMode="auto">
                     <a:xfrm>
                       <a:off x="0" y="0"/>
-                      <a:ext cx="2667000" cy="5778500"/>
+                      <a:ext cx="1495384" cy="3239999"/>
                     </a:xfrm>
                     <a:prstGeom prst="rect">
                       <a:avLst/>
@@ -6144,7 +6288,7 @@
         </w:rPr>
         <w:drawing>
           <wp:inline>
-            <wp:extent cx="2667000" cy="1511501"/>
+            <wp:extent cx="5334000" cy="3023002"/>
             <wp:effectExtent b="0" l="0" r="0" t="0"/>
             <wp:docPr descr="" title="" id="131" name="Picture"/>
             <a:graphic>
@@ -6165,7 +6309,7 @@
                   <pic:spPr bwMode="auto">
                     <a:xfrm>
                       <a:off x="0" y="0"/>
-                      <a:ext cx="2667000" cy="1511501"/>
+                      <a:ext cx="5334000" cy="3023002"/>
                     </a:xfrm>
                     <a:prstGeom prst="rect">
                       <a:avLst/>
@@ -6420,6 +6564,18 @@
         <w:t xml:space="preserve">3. תיאור מחלקות הפרויקט</w:t>
       </w:r>
     </w:p>
+    <w:p>
+      <w:pPr>
+        <w:bidi w:val="1"/>
+        <w:jc w:val="right"/>
+      </w:pPr>
+      <w:r>
+        <w:rPr>
+          <w:rtl w:val="1"/>
+        </w:rPr>
+        <w:br w:type="page"/>
+      </w:r>
+    </w:p>
     <w:bookmarkStart w:id="139" w:name="מחלקות-מודל-model-classes"/>
     <w:p>
       <w:pPr>
@@ -8521,6 +8677,18 @@
         </w:pict>
       </w:r>
     </w:p>
+    <w:p>
+      <w:pPr>
+        <w:bidi w:val="1"/>
+        <w:jc w:val="right"/>
+      </w:pPr>
+      <w:r>
+        <w:rPr>
+          <w:rtl w:val="1"/>
+        </w:rPr>
+        <w:br w:type="page"/>
+      </w:r>
+    </w:p>
     <w:bookmarkEnd w:id="138"/>
     <w:bookmarkEnd w:id="139"/>
     <w:bookmarkStart w:id="153" w:name="מחלקות-פעילות-activity-classes"/>
@@ -9696,6 +9864,18 @@
         </w:pict>
       </w:r>
     </w:p>
+    <w:p>
+      <w:pPr>
+        <w:bidi w:val="1"/>
+        <w:jc w:val="right"/>
+      </w:pPr>
+      <w:r>
+        <w:rPr>
+          <w:rtl w:val="1"/>
+        </w:rPr>
+        <w:br w:type="page"/>
+      </w:r>
+    </w:p>
     <w:bookmarkEnd w:id="152"/>
     <w:bookmarkEnd w:id="153"/>
     <w:bookmarkStart w:id="156" w:name="מחלקות-תצוגה-מותאמות-אישית-custom-views"/>
@@ -10369,6 +10549,18 @@
         </w:pict>
       </w:r>
     </w:p>
+    <w:p>
+      <w:pPr>
+        <w:bidi w:val="1"/>
+        <w:jc w:val="right"/>
+      </w:pPr>
+      <w:r>
+        <w:rPr>
+          <w:rtl w:val="1"/>
+        </w:rPr>
+        <w:br w:type="page"/>
+      </w:r>
+    </w:p>
     <w:bookmarkEnd w:id="155"/>
     <w:bookmarkEnd w:id="156"/>
     <w:bookmarkStart w:id="161" w:name="מחלקות-עזר-helper-classes"/>
@@ -11078,6 +11270,18 @@
         </w:pict>
       </w:r>
     </w:p>
+    <w:p>
+      <w:pPr>
+        <w:bidi w:val="1"/>
+        <w:jc w:val="right"/>
+      </w:pPr>
+      <w:r>
+        <w:rPr>
+          <w:rtl w:val="1"/>
+        </w:rPr>
+        <w:br w:type="page"/>
+      </w:r>
+    </w:p>
     <w:bookmarkEnd w:id="160"/>
     <w:bookmarkEnd w:id="161"/>
     <w:bookmarkStart w:id="168" w:name="מחלקות-שירות-workers-ו-receivers"/>
@@ -11355,6 +11559,18 @@
         <w:pict>
           <v:rect style="width:0;height:1.5pt" o:hralign="center" o:hrstd="t" o:hr="t"/>
         </w:pict>
+      </w:r>
+    </w:p>
+    <w:p>
+      <w:pPr>
+        <w:bidi w:val="1"/>
+        <w:jc w:val="right"/>
+      </w:pPr>
+      <w:r>
+        <w:rPr>
+          <w:rtl w:val="1"/>
+        </w:rPr>
+        <w:br w:type="page"/>
       </w:r>
     </w:p>
     <w:bookmarkEnd w:id="167"/>
@@ -11640,6 +11856,18 @@
         <w:t xml:space="preserve">4. קשרים בין המחלקות (UML)</w:t>
       </w:r>
     </w:p>
+    <w:p>
+      <w:pPr>
+        <w:bidi w:val="1"/>
+        <w:jc w:val="right"/>
+      </w:pPr>
+      <w:r>
+        <w:rPr>
+          <w:rtl w:val="1"/>
+        </w:rPr>
+        <w:br w:type="page"/>
+      </w:r>
+    </w:p>
     <w:bookmarkStart w:id="178" w:name="תרשים-מחלקות-class-diagram"/>
     <w:p>
       <w:pPr>
@@ -11666,7 +11894,7 @@
         </w:rPr>
         <w:drawing>
           <wp:inline>
-            <wp:extent cx="2667000" cy="4787947"/>
+            <wp:extent cx="5334000" cy="9575895"/>
             <wp:effectExtent b="0" l="0" r="0" t="0"/>
             <wp:docPr descr="" title="" id="176" name="Picture"/>
             <a:graphic>
@@ -11687,7 +11915,7 @@
                   <pic:spPr bwMode="auto">
                     <a:xfrm>
                       <a:off x="0" y="0"/>
-                      <a:ext cx="2667000" cy="4787947"/>
+                      <a:ext cx="5334000" cy="9575895"/>
                     </a:xfrm>
                     <a:prstGeom prst="rect">
                       <a:avLst/>
@@ -11706,6 +11934,18 @@
         </w:drawing>
       </w:r>
     </w:p>
+    <w:p>
+      <w:pPr>
+        <w:bidi w:val="1"/>
+        <w:jc w:val="right"/>
+      </w:pPr>
+      <w:r>
+        <w:rPr>
+          <w:rtl w:val="1"/>
+        </w:rPr>
+        <w:br w:type="page"/>
+      </w:r>
+    </w:p>
     <w:bookmarkEnd w:id="178"/>
     <w:bookmarkStart w:id="182" w:name="תרשים-קשרי-רכיבים-component-diagram"/>
     <w:p>
@@ -11733,7 +11973,7 @@
         </w:rPr>
         <w:drawing>
           <wp:inline>
-            <wp:extent cx="2667000" cy="579257"/>
+            <wp:extent cx="5334000" cy="1158515"/>
             <wp:effectExtent b="0" l="0" r="0" t="0"/>
             <wp:docPr descr="" title="" id="180" name="Picture"/>
             <a:graphic>
@@ -11754,7 +11994,7 @@
                   <pic:spPr bwMode="auto">
                     <a:xfrm>
                       <a:off x="0" y="0"/>
-                      <a:ext cx="2667000" cy="579257"/>
+                      <a:ext cx="5334000" cy="1158515"/>
                     </a:xfrm>
                     <a:prstGeom prst="rect">
                       <a:avLst/>
@@ -11773,6 +12013,18 @@
         </w:drawing>
       </w:r>
     </w:p>
+    <w:p>
+      <w:pPr>
+        <w:bidi w:val="1"/>
+        <w:jc w:val="right"/>
+      </w:pPr>
+      <w:r>
+        <w:rPr>
+          <w:rtl w:val="1"/>
+        </w:rPr>
+        <w:br w:type="page"/>
+      </w:r>
+    </w:p>
     <w:bookmarkEnd w:id="182"/>
     <w:bookmarkStart w:id="183" w:name="עיקרי-הקשרים"/>
     <w:p>
@@ -12573,6 +12825,18 @@
         <w:t xml:space="preserve">5. תיאור מבנה הנתונים ב-Firebase</w:t>
       </w:r>
     </w:p>
+    <w:p>
+      <w:pPr>
+        <w:bidi w:val="1"/>
+        <w:jc w:val="right"/>
+      </w:pPr>
+      <w:r>
+        <w:rPr>
+          <w:rtl w:val="1"/>
+        </w:rPr>
+        <w:br w:type="page"/>
+      </w:r>
+    </w:p>
     <w:bookmarkStart w:id="185" w:name="firebase-authentication"/>
     <w:p>
       <w:pPr>
@@ -12698,6 +12962,18 @@
           <w:rtl w:val="1"/>
         </w:rPr>
         <w:t xml:space="preserve">)</w:t>
+      </w:r>
+    </w:p>
+    <w:p>
+      <w:pPr>
+        <w:bidi w:val="1"/>
+        <w:jc w:val="right"/>
+      </w:pPr>
+      <w:r>
+        <w:rPr>
+          <w:rtl w:val="1"/>
+        </w:rPr>
+        <w:br w:type="page"/>
       </w:r>
     </w:p>
     <w:bookmarkEnd w:id="185"/>
@@ -12727,7 +13003,7 @@
         </w:rPr>
         <w:drawing>
           <wp:inline>
-            <wp:extent cx="2667000" cy="1550721"/>
+            <wp:extent cx="5334000" cy="3101443"/>
             <wp:effectExtent b="0" l="0" r="0" t="0"/>
             <wp:docPr descr="" title="" id="187" name="Picture"/>
             <a:graphic>
@@ -12748,7 +13024,7 @@
                   <pic:spPr bwMode="auto">
                     <a:xfrm>
                       <a:off x="0" y="0"/>
-                      <a:ext cx="2667000" cy="1550721"/>
+                      <a:ext cx="5334000" cy="3101443"/>
                     </a:xfrm>
                     <a:prstGeom prst="rect">
                       <a:avLst/>
@@ -12765,6 +13041,18 @@
             </a:graphic>
           </wp:inline>
         </w:drawing>
+      </w:r>
+    </w:p>
+    <w:p>
+      <w:pPr>
+        <w:bidi w:val="1"/>
+        <w:jc w:val="right"/>
+      </w:pPr>
+      <w:r>
+        <w:rPr>
+          <w:rtl w:val="1"/>
+        </w:rPr>
+        <w:br w:type="page"/>
       </w:r>
     </w:p>
     <w:bookmarkEnd w:id="189"/>

</xml_diff>

<commit_message>
Regenerate DOCX with updated component diagram and relationships section
Co-Authored-By: Claude Sonnet 4.6 (1M context) <noreply@anthropic.com>
</commit_message>
<xml_diff>
--- a/docs/screens-and-architecture-he.docx
+++ b/docs/screens-and-architecture-he.docx
@@ -11973,7 +11973,7 @@
         </w:rPr>
         <w:drawing>
           <wp:inline>
-            <wp:extent cx="5334000" cy="1158515"/>
+            <wp:extent cx="5334000" cy="6058072"/>
             <wp:effectExtent b="0" l="0" r="0" t="0"/>
             <wp:docPr descr="" title="" id="180" name="Picture"/>
             <a:graphic>
@@ -11994,7 +11994,7 @@
                   <pic:spPr bwMode="auto">
                     <a:xfrm>
                       <a:off x="0" y="0"/>
-                      <a:ext cx="5334000" cy="1158515"/>
+                      <a:ext cx="5334000" cy="6058072"/>
                     </a:xfrm>
                     <a:prstGeom prst="rect">
                       <a:avLst/>
@@ -12043,11 +12043,7 @@
     <w:p>
       <w:pPr>
         <w:bidi w:val="1"/>
-        <w:pStyle w:val="Compact"/>
-        <w:numPr>
-          <w:ilvl w:val="0"/>
-          <w:numId w:val="1002"/>
-        </w:numPr>
+        <w:pStyle w:val="FirstParagraph"/>
         <w:jc w:val="right"/>
       </w:pPr>
       <w:r>
@@ -12056,14 +12052,88 @@
           <w:bCs/>
           <w:rtl w:val="1"/>
         </w:rPr>
-        <w:t xml:space="preserve">כל</w:t>
-      </w:r>
-      <w:r>
-        <w:rPr>
+        <w:t xml:space="preserve">שכבת אתחול ואימות:</w:t>
+      </w:r>
+      <w:r>
+        <w:rPr>
+          <w:rtl w:val="1"/>
+        </w:rPr>
+        <w:t xml:space="preserve"> </w:t>
+      </w:r>
+      <w:r>
+        <w:rPr>
+          <w:rtl w:val="1"/>
+        </w:rPr>
+        <w:t xml:space="preserve">-</w:t>
+      </w:r>
+      <w:r>
+        <w:rPr>
+          <w:rtl w:val="1"/>
+        </w:rPr>
+        <w:t xml:space="preserve"> </w:t>
+      </w:r>
+      <w:r>
+        <w:rPr>
+          <w:rStyle w:val="VerbatimChar"/>
           <w:b/>
           <w:bCs/>
           <w:rtl w:val="1"/>
         </w:rPr>
+        <w:t xml:space="preserve">PhizApplication</w:t>
+      </w:r>
+      <w:r>
+        <w:rPr>
+          <w:rtl w:val="1"/>
+        </w:rPr>
+        <w:t xml:space="preserve"> </w:t>
+      </w:r>
+      <w:r>
+        <w:rPr>
+          <w:rtl w:val="1"/>
+        </w:rPr>
+        <w:t xml:space="preserve">מופעלת לפני כל רכיב אחר ומאתחלת את Firebase.</w:t>
+      </w:r>
+      <w:r>
+        <w:rPr>
+          <w:rtl w:val="1"/>
+        </w:rPr>
+        <w:t xml:space="preserve"> </w:t>
+      </w:r>
+      <w:r>
+        <w:rPr>
+          <w:rStyle w:val="VerbatimChar"/>
+          <w:rtl w:val="1"/>
+        </w:rPr>
+        <w:t xml:space="preserve">MainActivity</w:t>
+      </w:r>
+      <w:r>
+        <w:rPr>
+          <w:rtl w:val="1"/>
+        </w:rPr>
+        <w:t xml:space="preserve"> </w:t>
+      </w:r>
+      <w:r>
+        <w:rPr>
+          <w:rtl w:val="1"/>
+        </w:rPr>
+        <w:t xml:space="preserve">בודקת מצב התחברות ומנתבת לאחד משני מסלולי הבית.</w:t>
+      </w:r>
+      <w:r>
+        <w:rPr>
+          <w:rtl w:val="1"/>
+        </w:rPr>
+        <w:t xml:space="preserve"> </w:t>
+      </w:r>
+      <w:r>
+        <w:rPr>
+          <w:rtl w:val="1"/>
+        </w:rPr>
+        <w:t xml:space="preserve">-</w:t>
+      </w:r>
+      <w:r>
+        <w:rPr>
+          <w:rtl w:val="1"/>
+        </w:rPr>
         <w:t xml:space="preserve"> </w:t>
       </w:r>
       <w:r>
@@ -12073,124 +12143,15 @@
           <w:bCs/>
           <w:rtl w:val="1"/>
         </w:rPr>
-        <w:t xml:space="preserve">User</w:t>
-      </w:r>
-      <w:r>
-        <w:rPr>
-          <w:rtl w:val="1"/>
-        </w:rPr>
-        <w:t xml:space="preserve"> </w:t>
-      </w:r>
-      <w:r>
-        <w:rPr>
-          <w:rtl w:val="1"/>
-        </w:rPr>
-        <w:t xml:space="preserve">מזוהה לפי</w:t>
-      </w:r>
-      <w:r>
-        <w:rPr>
-          <w:rtl w:val="1"/>
-        </w:rPr>
-        <w:t xml:space="preserve"> </w:t>
-      </w:r>
-      <w:r>
-        <w:rPr>
-          <w:rStyle w:val="VerbatimChar"/>
-          <w:rtl w:val="1"/>
-        </w:rPr>
-        <w:t xml:space="preserve">uid</w:t>
-      </w:r>
-      <w:r>
-        <w:rPr>
-          <w:rtl w:val="1"/>
-        </w:rPr>
-        <w:t xml:space="preserve"> </w:t>
-      </w:r>
-      <w:r>
-        <w:rPr>
-          <w:rtl w:val="1"/>
-        </w:rPr>
-        <w:t xml:space="preserve">ובעל</w:t>
-      </w:r>
-      <w:r>
-        <w:rPr>
-          <w:rtl w:val="1"/>
-        </w:rPr>
-        <w:t xml:space="preserve"> </w:t>
-      </w:r>
-      <w:r>
-        <w:rPr>
-          <w:rStyle w:val="VerbatimChar"/>
-          <w:rtl w:val="1"/>
-        </w:rPr>
-        <w:t xml:space="preserve">role</w:t>
-      </w:r>
-      <w:r>
-        <w:rPr>
-          <w:rtl w:val="1"/>
-        </w:rPr>
-        <w:t xml:space="preserve"> </w:t>
-      </w:r>
-      <w:r>
-        <w:rPr>
-          <w:rtl w:val="1"/>
-        </w:rPr>
-        <w:t xml:space="preserve">יחיד (</w:t>
-      </w:r>
-      <w:r>
-        <w:rPr>
-          <w:rtl w:val="1"/>
-        </w:rPr>
-        <w:t xml:space="preserve">“student”</w:t>
-      </w:r>
-      <w:r>
-        <w:rPr>
-          <w:rtl w:val="1"/>
-        </w:rPr>
-        <w:t xml:space="preserve"> </w:t>
-      </w:r>
-      <w:r>
-        <w:rPr>
-          <w:rtl w:val="1"/>
-        </w:rPr>
-        <w:t xml:space="preserve">או</w:t>
-      </w:r>
-      <w:r>
-        <w:rPr>
-          <w:rtl w:val="1"/>
-        </w:rPr>
-        <w:t xml:space="preserve"> </w:t>
-      </w:r>
-      <w:r>
-        <w:rPr>
-          <w:rtl w:val="1"/>
-        </w:rPr>
-        <w:t xml:space="preserve">“teacher”</w:t>
-      </w:r>
-      <w:r>
-        <w:rPr>
-          <w:rtl w:val="1"/>
-        </w:rPr>
-        <w:t xml:space="preserve">).</w:t>
-      </w:r>
-    </w:p>
-    <w:p>
-      <w:pPr>
-        <w:bidi w:val="1"/>
-        <w:pStyle w:val="Compact"/>
-        <w:numPr>
-          <w:ilvl w:val="0"/>
-          <w:numId w:val="1002"/>
-        </w:numPr>
-        <w:jc w:val="right"/>
-      </w:pPr>
+        <w:t xml:space="preserve">LoginActivity</w:t>
+      </w:r>
       <w:r>
         <w:rPr>
           <w:b/>
           <w:bCs/>
           <w:rtl w:val="1"/>
         </w:rPr>
-        <w:t xml:space="preserve">כל</w:t>
+        <w:t xml:space="preserve"> </w:t>
       </w:r>
       <w:r>
         <w:rPr>
@@ -12198,7 +12159,7 @@
           <w:bCs/>
           <w:rtl w:val="1"/>
         </w:rPr>
-        <w:t xml:space="preserve"> </w:t>
+        <w:t xml:space="preserve">ו-</w:t>
       </w:r>
       <w:r>
         <w:rPr>
@@ -12207,73 +12168,156 @@
           <w:bCs/>
           <w:rtl w:val="1"/>
         </w:rPr>
-        <w:t xml:space="preserve">User</w:t>
-      </w:r>
+        <w:t xml:space="preserve">RegisterActivity</w:t>
+      </w:r>
+      <w:r>
+        <w:rPr>
+          <w:rtl w:val="1"/>
+        </w:rPr>
+        <w:t xml:space="preserve"> </w:t>
+      </w:r>
+      <w:r>
+        <w:rPr>
+          <w:rtl w:val="1"/>
+        </w:rPr>
+        <w:t xml:space="preserve">מקושרות דו-כיוונית; שתיהן קוראות ל-</w:t>
+      </w:r>
+      <w:r>
+        <w:rPr>
+          <w:rStyle w:val="VerbatimChar"/>
+          <w:rtl w:val="1"/>
+        </w:rPr>
+        <w:t xml:space="preserve">FCMTokenManager</w:t>
+      </w:r>
+      <w:r>
+        <w:rPr>
+          <w:rtl w:val="1"/>
+        </w:rPr>
+        <w:t xml:space="preserve"> </w:t>
+      </w:r>
+      <w:r>
+        <w:rPr>
+          <w:rtl w:val="1"/>
+        </w:rPr>
+        <w:t xml:space="preserve">לאחר הצלחה כדי לשמור את ה-Push token.</w:t>
+      </w:r>
+    </w:p>
+    <w:p>
+      <w:pPr>
+        <w:bidi w:val="1"/>
+        <w:pStyle w:val="BodyText"/>
+        <w:jc w:val="right"/>
+      </w:pPr>
       <w:r>
         <w:rPr>
           <w:b/>
           <w:bCs/>
           <w:rtl w:val="1"/>
         </w:rPr>
-        <w:t xml:space="preserve"> </w:t>
-      </w:r>
-      <w:r>
-        <w:rPr>
+        <w:t xml:space="preserve">שכבת מסכים:</w:t>
+      </w:r>
+      <w:r>
+        <w:rPr>
+          <w:rtl w:val="1"/>
+        </w:rPr>
+        <w:t xml:space="preserve"> </w:t>
+      </w:r>
+      <w:r>
+        <w:rPr>
+          <w:rtl w:val="1"/>
+        </w:rPr>
+        <w:t xml:space="preserve">-</w:t>
+      </w:r>
+      <w:r>
+        <w:rPr>
+          <w:rtl w:val="1"/>
+        </w:rPr>
+        <w:t xml:space="preserve"> </w:t>
+      </w:r>
+      <w:r>
+        <w:rPr>
+          <w:rStyle w:val="VerbatimChar"/>
           <w:b/>
           <w:bCs/>
           <w:rtl w:val="1"/>
         </w:rPr>
-        <w:t xml:space="preserve">(תלמיד)</w:t>
-      </w:r>
-      <w:r>
-        <w:rPr>
-          <w:rtl w:val="1"/>
-        </w:rPr>
-        <w:t xml:space="preserve"> </w:t>
-      </w:r>
-      <w:r>
-        <w:rPr>
-          <w:rtl w:val="1"/>
-        </w:rPr>
-        <w:t xml:space="preserve">יכול ליצור מספר רשומות</w:t>
-      </w:r>
-      <w:r>
-        <w:rPr>
-          <w:rtl w:val="1"/>
-        </w:rPr>
-        <w:t xml:space="preserve"> </w:t>
-      </w:r>
-      <w:r>
-        <w:rPr>
-          <w:rStyle w:val="VerbatimChar"/>
-          <w:rtl w:val="1"/>
-        </w:rPr>
-        <w:t xml:space="preserve">QuizResult</w:t>
-      </w:r>
-      <w:r>
-        <w:rPr>
-          <w:rtl w:val="1"/>
-        </w:rPr>
-        <w:t xml:space="preserve">.</w:t>
-      </w:r>
-    </w:p>
-    <w:p>
-      <w:pPr>
-        <w:bidi w:val="1"/>
-        <w:pStyle w:val="Compact"/>
-        <w:numPr>
-          <w:ilvl w:val="0"/>
-          <w:numId w:val="1002"/>
-        </w:numPr>
-        <w:jc w:val="right"/>
-      </w:pPr>
-      <w:r>
-        <w:rPr>
+        <w:t xml:space="preserve">StudentHomeActivity</w:t>
+      </w:r>
+      <w:r>
+        <w:rPr>
+          <w:rtl w:val="1"/>
+        </w:rPr>
+        <w:t xml:space="preserve"> </w:t>
+      </w:r>
+      <w:r>
+        <w:rPr>
+          <w:rtl w:val="1"/>
+        </w:rPr>
+        <w:t xml:space="preserve">ו-</w:t>
+      </w:r>
+      <w:r>
+        <w:rPr>
+          <w:rStyle w:val="VerbatimChar"/>
           <w:b/>
           <w:bCs/>
           <w:rtl w:val="1"/>
         </w:rPr>
-        <w:t xml:space="preserve">כל</w:t>
+        <w:t xml:space="preserve">TeacherHomeActivity</w:t>
+      </w:r>
+      <w:r>
+        <w:rPr>
+          <w:rtl w:val="1"/>
+        </w:rPr>
+        <w:t xml:space="preserve"> </w:t>
+      </w:r>
+      <w:r>
+        <w:rPr>
+          <w:rtl w:val="1"/>
+        </w:rPr>
+        <w:t xml:space="preserve">הן עצמאיות לחלוטין – כל אחת מנותבת לפי שדה</w:t>
+      </w:r>
+      <w:r>
+        <w:rPr>
+          <w:rtl w:val="1"/>
+        </w:rPr>
+        <w:t xml:space="preserve"> </w:t>
+      </w:r>
+      <w:r>
+        <w:rPr>
+          <w:rStyle w:val="VerbatimChar"/>
+          <w:rtl w:val="1"/>
+        </w:rPr>
+        <w:t xml:space="preserve">role</w:t>
+      </w:r>
+      <w:r>
+        <w:rPr>
+          <w:rtl w:val="1"/>
+        </w:rPr>
+        <w:t xml:space="preserve"> </w:t>
+      </w:r>
+      <w:r>
+        <w:rPr>
+          <w:rtl w:val="1"/>
+        </w:rPr>
+        <w:t xml:space="preserve">ב-Firestore ואינה נגישה לתפקיד השני.</w:t>
+      </w:r>
+      <w:r>
+        <w:rPr>
+          <w:rtl w:val="1"/>
+        </w:rPr>
+        <w:t xml:space="preserve"> </w:t>
+      </w:r>
+      <w:r>
+        <w:rPr>
+          <w:rtl w:val="1"/>
+        </w:rPr>
+        <w:t xml:space="preserve">- כל</w:t>
+      </w:r>
+      <w:r>
+        <w:rPr>
+          <w:rtl w:val="1"/>
+        </w:rPr>
+        <w:t xml:space="preserve"> </w:t>
       </w:r>
       <w:r>
         <w:rPr>
@@ -12281,6 +12325,61 @@
           <w:bCs/>
           <w:rtl w:val="1"/>
         </w:rPr>
+        <w:t xml:space="preserve">Activities</w:t>
+      </w:r>
+      <w:r>
+        <w:rPr>
+          <w:rtl w:val="1"/>
+        </w:rPr>
+        <w:t xml:space="preserve"> </w:t>
+      </w:r>
+      <w:r>
+        <w:rPr>
+          <w:rtl w:val="1"/>
+        </w:rPr>
+        <w:t xml:space="preserve">(תלמיד ומורה כאחד) שולחות פעולות קריאה/כתיבה אך ורק דרך</w:t>
+      </w:r>
+      <w:r>
+        <w:rPr>
+          <w:rtl w:val="1"/>
+        </w:rPr>
+        <w:t xml:space="preserve"> </w:t>
+      </w:r>
+      <w:r>
+        <w:rPr>
+          <w:rStyle w:val="VerbatimChar"/>
+          <w:rtl w:val="1"/>
+        </w:rPr>
+        <w:t xml:space="preserve">FirestoreHelper</w:t>
+      </w:r>
+      <w:r>
+        <w:rPr>
+          <w:rtl w:val="1"/>
+        </w:rPr>
+        <w:t xml:space="preserve"> </w:t>
+      </w:r>
+      <w:r>
+        <w:rPr>
+          <w:rtl w:val="1"/>
+        </w:rPr>
+        <w:t xml:space="preserve">— אין גישה ישירה ל-Firestore מהמסכים.</w:t>
+      </w:r>
+      <w:r>
+        <w:rPr>
+          <w:rtl w:val="1"/>
+        </w:rPr>
+        <w:t xml:space="preserve"> </w:t>
+      </w:r>
+      <w:r>
+        <w:rPr>
+          <w:rtl w:val="1"/>
+        </w:rPr>
+        <w:t xml:space="preserve">-</w:t>
+      </w:r>
+      <w:r>
+        <w:rPr>
+          <w:rtl w:val="1"/>
+        </w:rPr>
         <w:t xml:space="preserve"> </w:t>
       </w:r>
       <w:r>
@@ -12290,73 +12389,25 @@
           <w:bCs/>
           <w:rtl w:val="1"/>
         </w:rPr>
-        <w:t xml:space="preserve">QuizResult</w:t>
-      </w:r>
-      <w:r>
-        <w:rPr>
-          <w:rtl w:val="1"/>
-        </w:rPr>
-        <w:t xml:space="preserve"> </w:t>
-      </w:r>
-      <w:r>
-        <w:rPr>
-          <w:rtl w:val="1"/>
-        </w:rPr>
-        <w:t xml:space="preserve">קשור ל-</w:t>
-      </w:r>
-      <w:r>
-        <w:rPr>
-          <w:rStyle w:val="VerbatimChar"/>
-          <w:rtl w:val="1"/>
-        </w:rPr>
-        <w:t xml:space="preserve">User</w:t>
-      </w:r>
-      <w:r>
-        <w:rPr>
-          <w:rtl w:val="1"/>
-        </w:rPr>
-        <w:t xml:space="preserve"> </w:t>
-      </w:r>
-      <w:r>
-        <w:rPr>
-          <w:rtl w:val="1"/>
-        </w:rPr>
-        <w:t xml:space="preserve">יחיד דרך</w:t>
-      </w:r>
-      <w:r>
-        <w:rPr>
-          <w:rtl w:val="1"/>
-        </w:rPr>
-        <w:t xml:space="preserve"> </w:t>
-      </w:r>
-      <w:r>
-        <w:rPr>
-          <w:rStyle w:val="VerbatimChar"/>
-          <w:rtl w:val="1"/>
-        </w:rPr>
-        <w:t xml:space="preserve">userId</w:t>
-      </w:r>
-      <w:r>
-        <w:rPr>
-          <w:rtl w:val="1"/>
-        </w:rPr>
-        <w:t xml:space="preserve"> </w:t>
-      </w:r>
-      <w:r>
-        <w:rPr>
-          <w:rtl w:val="1"/>
-        </w:rPr>
-        <w:t xml:space="preserve">ולמבחן שבוצע.</w:t>
-      </w:r>
-    </w:p>
-    <w:p>
-      <w:pPr>
-        <w:bidi w:val="1"/>
-        <w:pStyle w:val="Compact"/>
-        <w:numPr>
-          <w:ilvl w:val="0"/>
-          <w:numId w:val="1002"/>
-        </w:numPr>
+        <w:t xml:space="preserve">NotificationSettingsActivity</w:t>
+      </w:r>
+      <w:r>
+        <w:rPr>
+          <w:rtl w:val="1"/>
+        </w:rPr>
+        <w:t xml:space="preserve"> </w:t>
+      </w:r>
+      <w:r>
+        <w:rPr>
+          <w:rtl w:val="1"/>
+        </w:rPr>
+        <w:t xml:space="preserve">קיימת בשני המסלולים (תלמיד ומורה), אך למורה מוסתרות אפשרויות התזכורות האישיות.</w:t>
+      </w:r>
+    </w:p>
+    <w:p>
+      <w:pPr>
+        <w:bidi w:val="1"/>
+        <w:pStyle w:val="BodyText"/>
         <w:jc w:val="right"/>
       </w:pPr>
       <w:r>
@@ -12365,15 +12416,46 @@
           <w:bCs/>
           <w:rtl w:val="1"/>
         </w:rPr>
-        <w:t xml:space="preserve">כל</w:t>
-      </w:r>
-      <w:r>
-        <w:rPr>
+        <w:t xml:space="preserve">שכבת Views ו-Adapters:</w:t>
+      </w:r>
+      <w:r>
+        <w:rPr>
+          <w:rtl w:val="1"/>
+        </w:rPr>
+        <w:t xml:space="preserve"> </w:t>
+      </w:r>
+      <w:r>
+        <w:rPr>
+          <w:rtl w:val="1"/>
+        </w:rPr>
+        <w:t xml:space="preserve">-</w:t>
+      </w:r>
+      <w:r>
+        <w:rPr>
+          <w:rtl w:val="1"/>
+        </w:rPr>
+        <w:t xml:space="preserve"> </w:t>
+      </w:r>
+      <w:r>
+        <w:rPr>
+          <w:rStyle w:val="VerbatimChar"/>
           <w:b/>
           <w:bCs/>
           <w:rtl w:val="1"/>
         </w:rPr>
-        <w:t xml:space="preserve"> </w:t>
+        <w:t xml:space="preserve">PhysicsSimulationView</w:t>
+      </w:r>
+      <w:r>
+        <w:rPr>
+          <w:rtl w:val="1"/>
+        </w:rPr>
+        <w:t xml:space="preserve"> </w:t>
+      </w:r>
+      <w:r>
+        <w:rPr>
+          <w:rtl w:val="1"/>
+        </w:rPr>
+        <w:t xml:space="preserve">ו-</w:t>
       </w:r>
       <w:r>
         <w:rPr>
@@ -12382,108 +12464,192 @@
           <w:bCs/>
           <w:rtl w:val="1"/>
         </w:rPr>
-        <w:t xml:space="preserve">Test</w:t>
-      </w:r>
-      <w:r>
-        <w:rPr>
-          <w:rtl w:val="1"/>
-        </w:rPr>
-        <w:t xml:space="preserve"> </w:t>
-      </w:r>
-      <w:r>
-        <w:rPr>
-          <w:rtl w:val="1"/>
-        </w:rPr>
-        <w:t xml:space="preserve">מכיל רשימה של</w:t>
-      </w:r>
-      <w:r>
-        <w:rPr>
-          <w:rtl w:val="1"/>
-        </w:rPr>
-        <w:t xml:space="preserve"> </w:t>
-      </w:r>
-      <w:r>
-        <w:rPr>
-          <w:rStyle w:val="VerbatimChar"/>
-          <w:rtl w:val="1"/>
-        </w:rPr>
-        <w:t xml:space="preserve">Question</w:t>
-      </w:r>
-      <w:r>
-        <w:rPr>
-          <w:rtl w:val="1"/>
-        </w:rPr>
-        <w:t xml:space="preserve"> </w:t>
-      </w:r>
-      <w:r>
-        <w:rPr>
-          <w:rtl w:val="1"/>
-        </w:rPr>
-        <w:t xml:space="preserve">ונוצר על ידי</w:t>
-      </w:r>
-      <w:r>
-        <w:rPr>
-          <w:rtl w:val="1"/>
-        </w:rPr>
-        <w:t xml:space="preserve"> </w:t>
-      </w:r>
-      <w:r>
-        <w:rPr>
-          <w:rStyle w:val="VerbatimChar"/>
-          <w:rtl w:val="1"/>
-        </w:rPr>
-        <w:t xml:space="preserve">User</w:t>
-      </w:r>
-      <w:r>
-        <w:rPr>
-          <w:rtl w:val="1"/>
-        </w:rPr>
-        <w:t xml:space="preserve"> </w:t>
-      </w:r>
-      <w:r>
-        <w:rPr>
-          <w:rtl w:val="1"/>
-        </w:rPr>
-        <w:t xml:space="preserve">מסוג מורה (</w:t>
-      </w:r>
-      <w:r>
-        <w:rPr>
-          <w:rStyle w:val="VerbatimChar"/>
-          <w:rtl w:val="1"/>
-        </w:rPr>
-        <w:t xml:space="preserve">createdBy</w:t>
-      </w:r>
-      <w:r>
-        <w:rPr>
-          <w:rtl w:val="1"/>
-        </w:rPr>
-        <w:t xml:space="preserve">).</w:t>
-      </w:r>
-    </w:p>
-    <w:p>
-      <w:pPr>
-        <w:bidi w:val="1"/>
-        <w:pStyle w:val="Compact"/>
-        <w:numPr>
-          <w:ilvl w:val="0"/>
-          <w:numId w:val="1002"/>
-        </w:numPr>
-        <w:jc w:val="right"/>
-      </w:pPr>
-      <w:r>
-        <w:rPr>
+        <w:t xml:space="preserve">DoodleView</w:t>
+      </w:r>
+      <w:r>
+        <w:rPr>
+          <w:rtl w:val="1"/>
+        </w:rPr>
+        <w:t xml:space="preserve"> </w:t>
+      </w:r>
+      <w:r>
+        <w:rPr>
+          <w:rtl w:val="1"/>
+        </w:rPr>
+        <w:t xml:space="preserve">הן</w:t>
+      </w:r>
+      <w:r>
+        <w:rPr>
+          <w:rtl w:val="1"/>
+        </w:rPr>
+        <w:t xml:space="preserve"> </w:t>
+      </w:r>
+      <w:r>
+        <w:rPr>
+          <w:rStyle w:val="VerbatimChar"/>
+          <w:rtl w:val="1"/>
+        </w:rPr>
+        <w:t xml:space="preserve">Custom Views</w:t>
+      </w:r>
+      <w:r>
+        <w:rPr>
+          <w:rtl w:val="1"/>
+        </w:rPr>
+        <w:t xml:space="preserve"> </w:t>
+      </w:r>
+      <w:r>
+        <w:rPr>
+          <w:rtl w:val="1"/>
+        </w:rPr>
+        <w:t xml:space="preserve">עצמאיות, ללא תלות ב-Firebase – כל לוגיקתן מקומית.</w:t>
+      </w:r>
+      <w:r>
+        <w:rPr>
+          <w:rtl w:val="1"/>
+        </w:rPr>
+        <w:t xml:space="preserve"> </w:t>
+      </w:r>
+      <w:r>
+        <w:rPr>
+          <w:rtl w:val="1"/>
+        </w:rPr>
+        <w:t xml:space="preserve">- מחלקות ה-</w:t>
+      </w:r>
+      <w:r>
+        <w:rPr>
+          <w:rStyle w:val="VerbatimChar"/>
           <w:b/>
           <w:bCs/>
           <w:rtl w:val="1"/>
         </w:rPr>
-        <w:t xml:space="preserve">כל</w:t>
-      </w:r>
+        <w:t xml:space="preserve">Adapter</w:t>
+      </w:r>
+      <w:r>
+        <w:rPr>
+          <w:rtl w:val="1"/>
+        </w:rPr>
+        <w:t xml:space="preserve"> </w:t>
+      </w:r>
+      <w:r>
+        <w:rPr>
+          <w:rtl w:val="1"/>
+        </w:rPr>
+        <w:t xml:space="preserve">(</w:t>
+      </w:r>
+      <w:r>
+        <w:rPr>
+          <w:rStyle w:val="VerbatimChar"/>
+          <w:rtl w:val="1"/>
+        </w:rPr>
+        <w:t xml:space="preserve">StudentAdapter</w:t>
+      </w:r>
+      <w:r>
+        <w:rPr>
+          <w:rtl w:val="1"/>
+        </w:rPr>
+        <w:t xml:space="preserve">,</w:t>
+      </w:r>
+      <w:r>
+        <w:rPr>
+          <w:rtl w:val="1"/>
+        </w:rPr>
+        <w:t xml:space="preserve"> </w:t>
+      </w:r>
+      <w:r>
+        <w:rPr>
+          <w:rStyle w:val="VerbatimChar"/>
+          <w:rtl w:val="1"/>
+        </w:rPr>
+        <w:t xml:space="preserve">GradeAdapter</w:t>
+      </w:r>
+      <w:r>
+        <w:rPr>
+          <w:rtl w:val="1"/>
+        </w:rPr>
+        <w:t xml:space="preserve">,</w:t>
+      </w:r>
+      <w:r>
+        <w:rPr>
+          <w:rtl w:val="1"/>
+        </w:rPr>
+        <w:t xml:space="preserve"> </w:t>
+      </w:r>
+      <w:r>
+        <w:rPr>
+          <w:rStyle w:val="VerbatimChar"/>
+          <w:rtl w:val="1"/>
+        </w:rPr>
+        <w:t xml:space="preserve">QuestionAdapter</w:t>
+      </w:r>
+      <w:r>
+        <w:rPr>
+          <w:rtl w:val="1"/>
+        </w:rPr>
+        <w:t xml:space="preserve">,</w:t>
+      </w:r>
+      <w:r>
+        <w:rPr>
+          <w:rtl w:val="1"/>
+        </w:rPr>
+        <w:t xml:space="preserve"> </w:t>
+      </w:r>
+      <w:r>
+        <w:rPr>
+          <w:rStyle w:val="VerbatimChar"/>
+          <w:rtl w:val="1"/>
+        </w:rPr>
+        <w:t xml:space="preserve">AllGradesAdapter</w:t>
+      </w:r>
+      <w:r>
+        <w:rPr>
+          <w:rtl w:val="1"/>
+        </w:rPr>
+        <w:t xml:space="preserve">) חיות בתוך ה-Activity שלהן ומחברות בין רשימת המודלים ל-</w:t>
+      </w:r>
+      <w:r>
+        <w:rPr>
+          <w:rStyle w:val="VerbatimChar"/>
+          <w:rtl w:val="1"/>
+        </w:rPr>
+        <w:t xml:space="preserve">RecyclerView</w:t>
+      </w:r>
+      <w:r>
+        <w:rPr>
+          <w:rtl w:val="1"/>
+        </w:rPr>
+        <w:t xml:space="preserve">.</w:t>
+      </w:r>
+    </w:p>
+    <w:p>
+      <w:pPr>
+        <w:bidi w:val="1"/>
+        <w:pStyle w:val="BodyText"/>
+        <w:jc w:val="right"/>
+      </w:pPr>
       <w:r>
         <w:rPr>
           <w:b/>
           <w:bCs/>
           <w:rtl w:val="1"/>
         </w:rPr>
+        <w:t xml:space="preserve">שכבת Helpers:</w:t>
+      </w:r>
+      <w:r>
+        <w:rPr>
+          <w:rtl w:val="1"/>
+        </w:rPr>
+        <w:t xml:space="preserve"> </w:t>
+      </w:r>
+      <w:r>
+        <w:rPr>
+          <w:rtl w:val="1"/>
+        </w:rPr>
+        <w:t xml:space="preserve">-</w:t>
+      </w:r>
+      <w:r>
+        <w:rPr>
+          <w:rtl w:val="1"/>
+        </w:rPr>
         <w:t xml:space="preserve"> </w:t>
       </w:r>
       <w:r>
@@ -12493,31 +12659,38 @@
           <w:bCs/>
           <w:rtl w:val="1"/>
         </w:rPr>
-        <w:t xml:space="preserve">Question</w:t>
-      </w:r>
-      <w:r>
-        <w:rPr>
-          <w:rtl w:val="1"/>
-        </w:rPr>
-        <w:t xml:space="preserve"> </w:t>
-      </w:r>
-      <w:r>
-        <w:rPr>
-          <w:rtl w:val="1"/>
-        </w:rPr>
-        <w:t xml:space="preserve">עומדת בפני עצמה במאגר וניתן לשייכה למספר מבחנים.</w:t>
-      </w:r>
-    </w:p>
-    <w:p>
-      <w:pPr>
-        <w:bidi w:val="1"/>
-        <w:pStyle w:val="Compact"/>
-        <w:numPr>
-          <w:ilvl w:val="0"/>
-          <w:numId w:val="1002"/>
-        </w:numPr>
-        <w:jc w:val="right"/>
-      </w:pPr>
+        <w:t xml:space="preserve">FirestoreHelper</w:t>
+      </w:r>
+      <w:r>
+        <w:rPr>
+          <w:rtl w:val="1"/>
+        </w:rPr>
+        <w:t xml:space="preserve"> </w:t>
+      </w:r>
+      <w:r>
+        <w:rPr>
+          <w:rtl w:val="1"/>
+        </w:rPr>
+        <w:t xml:space="preserve">הוא Singleton — נקודת הגישה היחידה ל-Firestore בכל האפליקציה.</w:t>
+      </w:r>
+      <w:r>
+        <w:rPr>
+          <w:rtl w:val="1"/>
+        </w:rPr>
+        <w:t xml:space="preserve"> </w:t>
+      </w:r>
+      <w:r>
+        <w:rPr>
+          <w:rtl w:val="1"/>
+        </w:rPr>
+        <w:t xml:space="preserve">-</w:t>
+      </w:r>
+      <w:r>
+        <w:rPr>
+          <w:rtl w:val="1"/>
+        </w:rPr>
+        <w:t xml:space="preserve"> </w:t>
+      </w:r>
       <w:r>
         <w:rPr>
           <w:rStyle w:val="VerbatimChar"/>
@@ -12525,77 +12698,153 @@
           <w:bCs/>
           <w:rtl w:val="1"/>
         </w:rPr>
-        <w:t xml:space="preserve">NotificationPreferences</w:t>
-      </w:r>
-      <w:r>
-        <w:rPr>
-          <w:rtl w:val="1"/>
-        </w:rPr>
-        <w:t xml:space="preserve"> </w:t>
-      </w:r>
-      <w:r>
-        <w:rPr>
-          <w:rtl w:val="1"/>
-        </w:rPr>
-        <w:t xml:space="preserve">משויך ל-</w:t>
-      </w:r>
-      <w:r>
-        <w:rPr>
-          <w:rStyle w:val="VerbatimChar"/>
-          <w:rtl w:val="1"/>
-        </w:rPr>
-        <w:t xml:space="preserve">User</w:t>
-      </w:r>
-      <w:r>
-        <w:rPr>
-          <w:rtl w:val="1"/>
-        </w:rPr>
-        <w:t xml:space="preserve"> </w:t>
-      </w:r>
-      <w:r>
-        <w:rPr>
-          <w:rtl w:val="1"/>
-        </w:rPr>
-        <w:t xml:space="preserve">יחיד ומשפיע על ה-</w:t>
-      </w:r>
-      <w:r>
-        <w:rPr>
-          <w:rStyle w:val="VerbatimChar"/>
-          <w:rtl w:val="1"/>
-        </w:rPr>
-        <w:t xml:space="preserve">Workers</w:t>
-      </w:r>
-      <w:r>
-        <w:rPr>
-          <w:rtl w:val="1"/>
-        </w:rPr>
-        <w:t xml:space="preserve">.</w:t>
-      </w:r>
-    </w:p>
-    <w:p>
-      <w:pPr>
-        <w:bidi w:val="1"/>
-        <w:pStyle w:val="Compact"/>
-        <w:numPr>
-          <w:ilvl w:val="0"/>
-          <w:numId w:val="1002"/>
-        </w:numPr>
-        <w:jc w:val="right"/>
-      </w:pPr>
-      <w:r>
-        <w:rPr>
+        <w:t xml:space="preserve">WorkerScheduler</w:t>
+      </w:r>
+      <w:r>
+        <w:rPr>
+          <w:rtl w:val="1"/>
+        </w:rPr>
+        <w:t xml:space="preserve"> </w:t>
+      </w:r>
+      <w:r>
+        <w:rPr>
+          <w:rtl w:val="1"/>
+        </w:rPr>
+        <w:t xml:space="preserve">מנהל את מחזור החיים של שלושת ה-Workers; הוא מופעל מחדש גם על ידי</w:t>
+      </w:r>
+      <w:r>
+        <w:rPr>
+          <w:rtl w:val="1"/>
+        </w:rPr>
+        <w:t xml:space="preserve"> </w:t>
+      </w:r>
+      <w:r>
+        <w:rPr>
+          <w:rStyle w:val="VerbatimChar"/>
+          <w:rtl w:val="1"/>
+        </w:rPr>
+        <w:t xml:space="preserve">BootReceiver</w:t>
+      </w:r>
+      <w:r>
+        <w:rPr>
+          <w:rtl w:val="1"/>
+        </w:rPr>
+        <w:t xml:space="preserve"> </w:t>
+      </w:r>
+      <w:r>
+        <w:rPr>
+          <w:rtl w:val="1"/>
+        </w:rPr>
+        <w:t xml:space="preserve">בעת הפעלת המכשיר.</w:t>
+      </w:r>
+      <w:r>
+        <w:rPr>
+          <w:rtl w:val="1"/>
+        </w:rPr>
+        <w:t xml:space="preserve"> </w:t>
+      </w:r>
+      <w:r>
+        <w:rPr>
+          <w:rtl w:val="1"/>
+        </w:rPr>
+        <w:t xml:space="preserve">-</w:t>
+      </w:r>
+      <w:r>
+        <w:rPr>
+          <w:rtl w:val="1"/>
+        </w:rPr>
+        <w:t xml:space="preserve"> </w:t>
+      </w:r>
+      <w:r>
+        <w:rPr>
+          <w:rStyle w:val="VerbatimChar"/>
           <w:b/>
           <w:bCs/>
           <w:rtl w:val="1"/>
         </w:rPr>
-        <w:t xml:space="preserve">מחלקת</w:t>
-      </w:r>
+        <w:t xml:space="preserve">NotificationHelper</w:t>
+      </w:r>
+      <w:r>
+        <w:rPr>
+          <w:rtl w:val="1"/>
+        </w:rPr>
+        <w:t xml:space="preserve"> </w:t>
+      </w:r>
+      <w:r>
+        <w:rPr>
+          <w:rtl w:val="1"/>
+        </w:rPr>
+        <w:t xml:space="preserve">מקבל קריאות משלושת ה-Workers, מ-</w:t>
+      </w:r>
+      <w:r>
+        <w:rPr>
+          <w:rStyle w:val="VerbatimChar"/>
+          <w:rtl w:val="1"/>
+        </w:rPr>
+        <w:t xml:space="preserve">PhizFirebaseMessagingService</w:t>
+      </w:r>
+      <w:r>
+        <w:rPr>
+          <w:rtl w:val="1"/>
+        </w:rPr>
+        <w:t xml:space="preserve"> </w:t>
+      </w:r>
+      <w:r>
+        <w:rPr>
+          <w:rtl w:val="1"/>
+        </w:rPr>
+        <w:t xml:space="preserve">ומ-</w:t>
+      </w:r>
+      <w:r>
+        <w:rPr>
+          <w:rStyle w:val="VerbatimChar"/>
+          <w:rtl w:val="1"/>
+        </w:rPr>
+        <w:t xml:space="preserve">NotificationActionReceiver</w:t>
+      </w:r>
+      <w:r>
+        <w:rPr>
+          <w:rtl w:val="1"/>
+        </w:rPr>
+        <w:t xml:space="preserve"> </w:t>
+      </w:r>
+      <w:r>
+        <w:rPr>
+          <w:rtl w:val="1"/>
+        </w:rPr>
+        <w:t xml:space="preserve">— הוא נקודת הריכוז היחידה להצגת התראות.</w:t>
+      </w:r>
+    </w:p>
+    <w:p>
+      <w:pPr>
+        <w:bidi w:val="1"/>
+        <w:pStyle w:val="BodyText"/>
+        <w:jc w:val="right"/>
+      </w:pPr>
       <w:r>
         <w:rPr>
           <w:b/>
           <w:bCs/>
           <w:rtl w:val="1"/>
         </w:rPr>
+        <w:t xml:space="preserve">שכבת Firebase:</w:t>
+      </w:r>
+      <w:r>
+        <w:rPr>
+          <w:rtl w:val="1"/>
+        </w:rPr>
+        <w:t xml:space="preserve"> </w:t>
+      </w:r>
+      <w:r>
+        <w:rPr>
+          <w:rtl w:val="1"/>
+        </w:rPr>
+        <w:t xml:space="preserve">-</w:t>
+      </w:r>
+      <w:r>
+        <w:rPr>
+          <w:rtl w:val="1"/>
+        </w:rPr>
         <w:t xml:space="preserve"> </w:t>
       </w:r>
       <w:r>
@@ -12617,170 +12866,128 @@
         <w:rPr>
           <w:rtl w:val="1"/>
         </w:rPr>
-        <w:t xml:space="preserve">היא נקודת הגישה היחידה לכל פעולות מסד הנתונים – היא מטפלת בשמירה, שליפה ומחיקה של כל הישויות.</w:t>
-      </w:r>
-    </w:p>
-    <w:p>
-      <w:pPr>
-        <w:bidi w:val="1"/>
-        <w:pStyle w:val="Compact"/>
-        <w:numPr>
-          <w:ilvl w:val="0"/>
-          <w:numId w:val="1002"/>
-        </w:numPr>
-        <w:jc w:val="right"/>
-      </w:pPr>
-      <w:r>
-        <w:rPr>
+        <w:t xml:space="preserve">→</w:t>
+      </w:r>
+      <w:r>
+        <w:rPr>
+          <w:rtl w:val="1"/>
+        </w:rPr>
+        <w:t xml:space="preserve"> </w:t>
+      </w:r>
+      <w:r>
+        <w:rPr>
+          <w:rStyle w:val="VerbatimChar"/>
+          <w:rtl w:val="1"/>
+        </w:rPr>
+        <w:t xml:space="preserve">Firebase Auth</w:t>
+      </w:r>
+      <w:r>
+        <w:rPr>
+          <w:rtl w:val="1"/>
+        </w:rPr>
+        <w:t xml:space="preserve"> </w:t>
+      </w:r>
+      <w:r>
+        <w:rPr>
+          <w:rtl w:val="1"/>
+        </w:rPr>
+        <w:t xml:space="preserve">+</w:t>
+      </w:r>
+      <w:r>
+        <w:rPr>
+          <w:rtl w:val="1"/>
+        </w:rPr>
+        <w:t xml:space="preserve"> </w:t>
+      </w:r>
+      <w:r>
+        <w:rPr>
+          <w:rStyle w:val="VerbatimChar"/>
+          <w:rtl w:val="1"/>
+        </w:rPr>
+        <w:t xml:space="preserve">Cloud Firestore</w:t>
+      </w:r>
+      <w:r>
+        <w:rPr>
+          <w:rtl w:val="1"/>
+        </w:rPr>
+        <w:t xml:space="preserve"> </w:t>
+      </w:r>
+      <w:r>
+        <w:rPr>
+          <w:rtl w:val="1"/>
+        </w:rPr>
+        <w:t xml:space="preserve">-</w:t>
+      </w:r>
+      <w:r>
+        <w:rPr>
+          <w:rtl w:val="1"/>
+        </w:rPr>
+        <w:t xml:space="preserve"> </w:t>
+      </w:r>
+      <w:r>
+        <w:rPr>
+          <w:rStyle w:val="VerbatimChar"/>
           <w:b/>
           <w:bCs/>
           <w:rtl w:val="1"/>
         </w:rPr>
-        <w:t xml:space="preserve">מחלקות ה-</w:t>
-      </w:r>
-      <w:r>
-        <w:rPr>
-          <w:rStyle w:val="VerbatimChar"/>
-          <w:b/>
-          <w:bCs/>
-          <w:rtl w:val="1"/>
-        </w:rPr>
-        <w:t xml:space="preserve">Adapter</w:t>
-      </w:r>
-      <w:r>
-        <w:rPr>
-          <w:rtl w:val="1"/>
-        </w:rPr>
-        <w:t xml:space="preserve"> </w:t>
-      </w:r>
-      <w:r>
-        <w:rPr>
-          <w:rtl w:val="1"/>
-        </w:rPr>
-        <w:t xml:space="preserve">מחברות בין הנתונים (Models) לבין ממשק המשתמש (</w:t>
-      </w:r>
-      <w:r>
-        <w:rPr>
-          <w:rStyle w:val="VerbatimChar"/>
-          <w:rtl w:val="1"/>
-        </w:rPr>
-        <w:t xml:space="preserve">RecyclerView</w:t>
-      </w:r>
-      <w:r>
-        <w:rPr>
-          <w:rtl w:val="1"/>
-        </w:rPr>
-        <w:t xml:space="preserve">).</w:t>
-      </w:r>
-    </w:p>
-    <w:p>
-      <w:pPr>
-        <w:bidi w:val="1"/>
-        <w:pStyle w:val="Compact"/>
-        <w:numPr>
-          <w:ilvl w:val="0"/>
-          <w:numId w:val="1002"/>
-        </w:numPr>
-        <w:jc w:val="right"/>
-      </w:pPr>
-      <w:r>
-        <w:rPr>
-          <w:b/>
-          <w:bCs/>
-          <w:rtl w:val="1"/>
-        </w:rPr>
-        <w:t xml:space="preserve">מחלקות ה-</w:t>
-      </w:r>
-      <w:r>
-        <w:rPr>
-          <w:rStyle w:val="VerbatimChar"/>
-          <w:b/>
-          <w:bCs/>
-          <w:rtl w:val="1"/>
-        </w:rPr>
-        <w:t xml:space="preserve">Workers</w:t>
-      </w:r>
-      <w:r>
-        <w:rPr>
-          <w:rtl w:val="1"/>
-        </w:rPr>
-        <w:t xml:space="preserve"> </w:t>
-      </w:r>
-      <w:r>
-        <w:rPr>
-          <w:rtl w:val="1"/>
-        </w:rPr>
-        <w:t xml:space="preserve">פועלות ברקע ותלויות ב-</w:t>
-      </w:r>
-      <w:r>
-        <w:rPr>
-          <w:rStyle w:val="VerbatimChar"/>
-          <w:rtl w:val="1"/>
-        </w:rPr>
-        <w:t xml:space="preserve">NotificationPreferences</w:t>
-      </w:r>
-      <w:r>
-        <w:rPr>
-          <w:rtl w:val="1"/>
-        </w:rPr>
-        <w:t xml:space="preserve"> </w:t>
-      </w:r>
-      <w:r>
-        <w:rPr>
-          <w:rtl w:val="1"/>
-        </w:rPr>
-        <w:t xml:space="preserve">ו-</w:t>
-      </w:r>
-      <w:r>
-        <w:rPr>
-          <w:rStyle w:val="VerbatimChar"/>
-          <w:rtl w:val="1"/>
-        </w:rPr>
-        <w:t xml:space="preserve">NotificationHelper</w:t>
-      </w:r>
-      <w:r>
-        <w:rPr>
-          <w:rtl w:val="1"/>
-        </w:rPr>
-        <w:t xml:space="preserve"> </w:t>
-      </w:r>
-      <w:r>
-        <w:rPr>
-          <w:rtl w:val="1"/>
-        </w:rPr>
-        <w:t xml:space="preserve">להצגת התראות.</w:t>
-      </w:r>
-    </w:p>
-    <w:p>
-      <w:pPr>
-        <w:bidi w:val="1"/>
-        <w:pStyle w:val="Compact"/>
-        <w:numPr>
-          <w:ilvl w:val="0"/>
-          <w:numId w:val="1002"/>
-        </w:numPr>
-        <w:jc w:val="right"/>
-      </w:pPr>
-      <w:r>
-        <w:rPr>
-          <w:rStyle w:val="VerbatimChar"/>
-          <w:b/>
-          <w:bCs/>
-          <w:rtl w:val="1"/>
-        </w:rPr>
-        <w:t xml:space="preserve">PhysicsSimulationView</w:t>
-      </w:r>
-      <w:r>
-        <w:rPr>
-          <w:rtl w:val="1"/>
-        </w:rPr>
-        <w:t xml:space="preserve"> </w:t>
-      </w:r>
-      <w:r>
-        <w:rPr>
-          <w:rtl w:val="1"/>
-        </w:rPr>
-        <w:t xml:space="preserve">עצמאית ואינה קשורה ל-Firebase – כל החישובים מקומיים.</w:t>
+        <w:t xml:space="preserve">FCMTokenManager</w:t>
+      </w:r>
+      <w:r>
+        <w:rPr>
+          <w:rtl w:val="1"/>
+        </w:rPr>
+        <w:t xml:space="preserve"> </w:t>
+      </w:r>
+      <w:r>
+        <w:rPr>
+          <w:rtl w:val="1"/>
+        </w:rPr>
+        <w:t xml:space="preserve">→</w:t>
+      </w:r>
+      <w:r>
+        <w:rPr>
+          <w:rtl w:val="1"/>
+        </w:rPr>
+        <w:t xml:space="preserve"> </w:t>
+      </w:r>
+      <w:r>
+        <w:rPr>
+          <w:rStyle w:val="VerbatimChar"/>
+          <w:rtl w:val="1"/>
+        </w:rPr>
+        <w:t xml:space="preserve">Firebase FCM</w:t>
+      </w:r>
+      <w:r>
+        <w:rPr>
+          <w:rtl w:val="1"/>
+        </w:rPr>
+        <w:t xml:space="preserve"> </w:t>
+      </w:r>
+      <w:r>
+        <w:rPr>
+          <w:rtl w:val="1"/>
+        </w:rPr>
+        <w:t xml:space="preserve">(שמירת token + קבלת הודעות Push דרך</w:t>
+      </w:r>
+      <w:r>
+        <w:rPr>
+          <w:rtl w:val="1"/>
+        </w:rPr>
+        <w:t xml:space="preserve"> </w:t>
+      </w:r>
+      <w:r>
+        <w:rPr>
+          <w:rStyle w:val="VerbatimChar"/>
+          <w:rtl w:val="1"/>
+        </w:rPr>
+        <w:t xml:space="preserve">PhizFirebaseMessagingService</w:t>
+      </w:r>
+      <w:r>
+        <w:rPr>
+          <w:rtl w:val="1"/>
+        </w:rPr>
+        <w:t xml:space="preserve">)</w:t>
       </w:r>
     </w:p>
     <w:p>
@@ -13168,7 +13375,7 @@
         <w:pStyle w:val="Compact"/>
         <w:numPr>
           <w:ilvl w:val="0"/>
-          <w:numId w:val="1003"/>
+          <w:numId w:val="1002"/>
         </w:numPr>
         <w:jc w:val="right"/>
       </w:pPr>
@@ -13305,6 +13512,421 @@
           <w:rtl w:val="1"/>
         </w:rPr>
         <w:t xml:space="preserve">.</w:t>
+      </w:r>
+    </w:p>
+    <w:p>
+      <w:pPr>
+        <w:bidi w:val="1"/>
+        <w:pStyle w:val="Compact"/>
+        <w:numPr>
+          <w:ilvl w:val="0"/>
+          <w:numId w:val="1002"/>
+        </w:numPr>
+        <w:jc w:val="right"/>
+      </w:pPr>
+      <w:r>
+        <w:rPr>
+          <w:b/>
+          <w:bCs/>
+          <w:rtl w:val="1"/>
+        </w:rPr>
+        <w:t xml:space="preserve">הנתונים (Models):</w:t>
+      </w:r>
+      <w:r>
+        <w:rPr>
+          <w:rtl w:val="1"/>
+        </w:rPr>
+        <w:t xml:space="preserve"> </w:t>
+      </w:r>
+      <w:r>
+        <w:rPr>
+          <w:rtl w:val="1"/>
+        </w:rPr>
+        <w:t xml:space="preserve">מחלקות</w:t>
+      </w:r>
+      <w:r>
+        <w:rPr>
+          <w:rtl w:val="1"/>
+        </w:rPr>
+        <w:t xml:space="preserve"> </w:t>
+      </w:r>
+      <w:r>
+        <w:rPr>
+          <w:rStyle w:val="VerbatimChar"/>
+          <w:rtl w:val="1"/>
+        </w:rPr>
+        <w:t xml:space="preserve">User</w:t>
+      </w:r>
+      <w:r>
+        <w:rPr>
+          <w:rtl w:val="1"/>
+        </w:rPr>
+        <w:t xml:space="preserve">,</w:t>
+      </w:r>
+      <w:r>
+        <w:rPr>
+          <w:rtl w:val="1"/>
+        </w:rPr>
+        <w:t xml:space="preserve"> </w:t>
+      </w:r>
+      <w:r>
+        <w:rPr>
+          <w:rStyle w:val="VerbatimChar"/>
+          <w:rtl w:val="1"/>
+        </w:rPr>
+        <w:t xml:space="preserve">Question</w:t>
+      </w:r>
+      <w:r>
+        <w:rPr>
+          <w:rtl w:val="1"/>
+        </w:rPr>
+        <w:t xml:space="preserve">,</w:t>
+      </w:r>
+      <w:r>
+        <w:rPr>
+          <w:rtl w:val="1"/>
+        </w:rPr>
+        <w:t xml:space="preserve"> </w:t>
+      </w:r>
+      <w:r>
+        <w:rPr>
+          <w:rStyle w:val="VerbatimChar"/>
+          <w:rtl w:val="1"/>
+        </w:rPr>
+        <w:t xml:space="preserve">Test</w:t>
+      </w:r>
+      <w:r>
+        <w:rPr>
+          <w:rtl w:val="1"/>
+        </w:rPr>
+        <w:t xml:space="preserve">,</w:t>
+      </w:r>
+      <w:r>
+        <w:rPr>
+          <w:rtl w:val="1"/>
+        </w:rPr>
+        <w:t xml:space="preserve"> </w:t>
+      </w:r>
+      <w:r>
+        <w:rPr>
+          <w:rStyle w:val="VerbatimChar"/>
+          <w:rtl w:val="1"/>
+        </w:rPr>
+        <w:t xml:space="preserve">QuizResult</w:t>
+      </w:r>
+      <w:r>
+        <w:rPr>
+          <w:rtl w:val="1"/>
+        </w:rPr>
+        <w:t xml:space="preserve">,</w:t>
+      </w:r>
+      <w:r>
+        <w:rPr>
+          <w:rtl w:val="1"/>
+        </w:rPr>
+        <w:t xml:space="preserve"> </w:t>
+      </w:r>
+      <w:r>
+        <w:rPr>
+          <w:rStyle w:val="VerbatimChar"/>
+          <w:rtl w:val="1"/>
+        </w:rPr>
+        <w:t xml:space="preserve">NotificationPreferences</w:t>
+      </w:r>
+      <w:r>
+        <w:rPr>
+          <w:rtl w:val="1"/>
+        </w:rPr>
+        <w:t xml:space="preserve">.</w:t>
+      </w:r>
+    </w:p>
+    <w:p>
+      <w:pPr>
+        <w:bidi w:val="1"/>
+        <w:pStyle w:val="Compact"/>
+        <w:numPr>
+          <w:ilvl w:val="0"/>
+          <w:numId w:val="1002"/>
+        </w:numPr>
+        <w:jc w:val="right"/>
+      </w:pPr>
+      <w:r>
+        <w:rPr>
+          <w:b/>
+          <w:bCs/>
+          <w:rtl w:val="1"/>
+        </w:rPr>
+        <w:t xml:space="preserve">שכבת העזר (Helpers):</w:t>
+      </w:r>
+      <w:r>
+        <w:rPr>
+          <w:rtl w:val="1"/>
+        </w:rPr>
+        <w:t xml:space="preserve"> </w:t>
+      </w:r>
+      <w:r>
+        <w:rPr>
+          <w:rStyle w:val="VerbatimChar"/>
+          <w:rtl w:val="1"/>
+        </w:rPr>
+        <w:t xml:space="preserve">FirestoreHelper</w:t>
+      </w:r>
+      <w:r>
+        <w:rPr>
+          <w:rtl w:val="1"/>
+        </w:rPr>
+        <w:t xml:space="preserve">,</w:t>
+      </w:r>
+      <w:r>
+        <w:rPr>
+          <w:rtl w:val="1"/>
+        </w:rPr>
+        <w:t xml:space="preserve"> </w:t>
+      </w:r>
+      <w:r>
+        <w:rPr>
+          <w:rStyle w:val="VerbatimChar"/>
+          <w:rtl w:val="1"/>
+        </w:rPr>
+        <w:t xml:space="preserve">NotificationHelper</w:t>
+      </w:r>
+      <w:r>
+        <w:rPr>
+          <w:rtl w:val="1"/>
+        </w:rPr>
+        <w:t xml:space="preserve">,</w:t>
+      </w:r>
+      <w:r>
+        <w:rPr>
+          <w:rtl w:val="1"/>
+        </w:rPr>
+        <w:t xml:space="preserve"> </w:t>
+      </w:r>
+      <w:r>
+        <w:rPr>
+          <w:rStyle w:val="VerbatimChar"/>
+          <w:rtl w:val="1"/>
+        </w:rPr>
+        <w:t xml:space="preserve">FCMTokenManager</w:t>
+      </w:r>
+      <w:r>
+        <w:rPr>
+          <w:rtl w:val="1"/>
+        </w:rPr>
+        <w:t xml:space="preserve">,</w:t>
+      </w:r>
+      <w:r>
+        <w:rPr>
+          <w:rtl w:val="1"/>
+        </w:rPr>
+        <w:t xml:space="preserve"> </w:t>
+      </w:r>
+      <w:r>
+        <w:rPr>
+          <w:rStyle w:val="VerbatimChar"/>
+          <w:rtl w:val="1"/>
+        </w:rPr>
+        <w:t xml:space="preserve">WorkerScheduler</w:t>
+      </w:r>
+      <w:r>
+        <w:rPr>
+          <w:rtl w:val="1"/>
+        </w:rPr>
+        <w:t xml:space="preserve"> </w:t>
+      </w:r>
+      <w:r>
+        <w:rPr>
+          <w:rtl w:val="1"/>
+        </w:rPr>
+        <w:t xml:space="preserve">– מנתקות את ה-Activities מהפרטים הטכניים של Firebase.</w:t>
+      </w:r>
+    </w:p>
+    <w:p>
+      <w:pPr>
+        <w:bidi w:val="1"/>
+        <w:pStyle w:val="Compact"/>
+        <w:numPr>
+          <w:ilvl w:val="0"/>
+          <w:numId w:val="1002"/>
+        </w:numPr>
+        <w:jc w:val="right"/>
+      </w:pPr>
+      <w:r>
+        <w:rPr>
+          <w:b/>
+          <w:bCs/>
+          <w:rtl w:val="1"/>
+        </w:rPr>
+        <w:t xml:space="preserve">ניהול הנתונים בענן:</w:t>
+      </w:r>
+      <w:r>
+        <w:rPr>
+          <w:rtl w:val="1"/>
+        </w:rPr>
+        <w:t xml:space="preserve"> </w:t>
+      </w:r>
+      <w:r>
+        <w:rPr>
+          <w:rtl w:val="1"/>
+        </w:rPr>
+        <w:t xml:space="preserve">Firebase Authentication + Firestore + FCM.</w:t>
+      </w:r>
+    </w:p>
+    <w:p>
+      <w:pPr>
+        <w:bidi w:val="1"/>
+        <w:pStyle w:val="Compact"/>
+        <w:numPr>
+          <w:ilvl w:val="0"/>
+          <w:numId w:val="1002"/>
+        </w:numPr>
+        <w:jc w:val="right"/>
+      </w:pPr>
+      <w:r>
+        <w:rPr>
+          <w:b/>
+          <w:bCs/>
+          <w:rtl w:val="1"/>
+        </w:rPr>
+        <w:t xml:space="preserve">משימות רקע:</w:t>
+      </w:r>
+      <w:r>
+        <w:rPr>
+          <w:rtl w:val="1"/>
+        </w:rPr>
+        <w:t xml:space="preserve"> </w:t>
+      </w:r>
+      <w:r>
+        <w:rPr>
+          <w:rStyle w:val="VerbatimChar"/>
+          <w:rtl w:val="1"/>
+        </w:rPr>
+        <w:t xml:space="preserve">WorkManager</w:t>
+      </w:r>
+      <w:r>
+        <w:rPr>
+          <w:rtl w:val="1"/>
+        </w:rPr>
+        <w:t xml:space="preserve"> </w:t>
+      </w:r>
+      <w:r>
+        <w:rPr>
+          <w:rtl w:val="1"/>
+        </w:rPr>
+        <w:t xml:space="preserve">עם</w:t>
+      </w:r>
+      <w:r>
+        <w:rPr>
+          <w:rtl w:val="1"/>
+        </w:rPr>
+        <w:t xml:space="preserve"> </w:t>
+      </w:r>
+      <w:r>
+        <w:rPr>
+          <w:rStyle w:val="VerbatimChar"/>
+          <w:rtl w:val="1"/>
+        </w:rPr>
+        <w:t xml:space="preserve">Workers</w:t>
+      </w:r>
+      <w:r>
+        <w:rPr>
+          <w:rtl w:val="1"/>
+        </w:rPr>
+        <w:t xml:space="preserve"> </w:t>
+      </w:r>
+      <w:r>
+        <w:rPr>
+          <w:rtl w:val="1"/>
+        </w:rPr>
+        <w:t xml:space="preserve">שונים, ו-</w:t>
+      </w:r>
+      <w:r>
+        <w:rPr>
+          <w:rStyle w:val="VerbatimChar"/>
+          <w:rtl w:val="1"/>
+        </w:rPr>
+        <w:t xml:space="preserve">BroadcastReceivers</w:t>
+      </w:r>
+      <w:r>
+        <w:rPr>
+          <w:rtl w:val="1"/>
+        </w:rPr>
+        <w:t xml:space="preserve"> </w:t>
+      </w:r>
+      <w:r>
+        <w:rPr>
+          <w:rtl w:val="1"/>
+        </w:rPr>
+        <w:t xml:space="preserve">לטיפול באירועי מערכת.</w:t>
+      </w:r>
+    </w:p>
+    <w:p>
+      <w:pPr>
+        <w:bidi w:val="1"/>
+        <w:pStyle w:val="Compact"/>
+        <w:numPr>
+          <w:ilvl w:val="0"/>
+          <w:numId w:val="1002"/>
+        </w:numPr>
+        <w:jc w:val="right"/>
+      </w:pPr>
+      <w:r>
+        <w:rPr>
+          <w:b/>
+          <w:bCs/>
+          <w:rtl w:val="1"/>
+        </w:rPr>
+        <w:t xml:space="preserve">חיבור בין הנתונים למסכים:</w:t>
+      </w:r>
+      <w:r>
+        <w:rPr>
+          <w:rtl w:val="1"/>
+        </w:rPr>
+        <w:t xml:space="preserve"> </w:t>
+      </w:r>
+      <w:r>
+        <w:rPr>
+          <w:rtl w:val="1"/>
+        </w:rPr>
+        <w:t xml:space="preserve">מחלקות</w:t>
+      </w:r>
+      <w:r>
+        <w:rPr>
+          <w:rtl w:val="1"/>
+        </w:rPr>
+        <w:t xml:space="preserve"> </w:t>
+      </w:r>
+      <w:r>
+        <w:rPr>
+          <w:rStyle w:val="VerbatimChar"/>
+          <w:rtl w:val="1"/>
+        </w:rPr>
+        <w:t xml:space="preserve">Adapter</w:t>
+      </w:r>
+      <w:r>
+        <w:rPr>
+          <w:rtl w:val="1"/>
+        </w:rPr>
+        <w:t xml:space="preserve"> </w:t>
+      </w:r>
+      <w:r>
+        <w:rPr>
+          <w:rtl w:val="1"/>
+        </w:rPr>
+        <w:t xml:space="preserve">פנימיות בכל מסך עם רשימה.</w:t>
+      </w:r>
+    </w:p>
+    <w:p>
+      <w:pPr>
+        <w:bidi w:val="1"/>
+        <w:pStyle w:val="FirstParagraph"/>
+        <w:jc w:val="right"/>
+      </w:pPr>
+      <w:r>
+        <w:rPr>
+          <w:rtl w:val="1"/>
+        </w:rPr>
+        <w:t xml:space="preserve">מבנה זה מאפשר:</w:t>
       </w:r>
     </w:p>
     <w:p>
@@ -13323,114 +13945,19 @@
           <w:bCs/>
           <w:rtl w:val="1"/>
         </w:rPr>
-        <w:t xml:space="preserve">הנתונים (Models):</w:t>
-      </w:r>
-      <w:r>
-        <w:rPr>
-          <w:rtl w:val="1"/>
-        </w:rPr>
-        <w:t xml:space="preserve"> </w:t>
-      </w:r>
-      <w:r>
-        <w:rPr>
-          <w:rtl w:val="1"/>
-        </w:rPr>
-        <w:t xml:space="preserve">מחלקות</w:t>
-      </w:r>
-      <w:r>
-        <w:rPr>
-          <w:rtl w:val="1"/>
-        </w:rPr>
-        <w:t xml:space="preserve"> </w:t>
-      </w:r>
-      <w:r>
-        <w:rPr>
-          <w:rStyle w:val="VerbatimChar"/>
-          <w:rtl w:val="1"/>
-        </w:rPr>
-        <w:t xml:space="preserve">User</w:t>
-      </w:r>
-      <w:r>
-        <w:rPr>
-          <w:rtl w:val="1"/>
-        </w:rPr>
-        <w:t xml:space="preserve">,</w:t>
-      </w:r>
-      <w:r>
-        <w:rPr>
-          <w:rtl w:val="1"/>
-        </w:rPr>
-        <w:t xml:space="preserve"> </w:t>
-      </w:r>
-      <w:r>
-        <w:rPr>
-          <w:rStyle w:val="VerbatimChar"/>
-          <w:rtl w:val="1"/>
-        </w:rPr>
-        <w:t xml:space="preserve">Question</w:t>
-      </w:r>
-      <w:r>
-        <w:rPr>
-          <w:rtl w:val="1"/>
-        </w:rPr>
-        <w:t xml:space="preserve">,</w:t>
-      </w:r>
-      <w:r>
-        <w:rPr>
-          <w:rtl w:val="1"/>
-        </w:rPr>
-        <w:t xml:space="preserve"> </w:t>
-      </w:r>
-      <w:r>
-        <w:rPr>
-          <w:rStyle w:val="VerbatimChar"/>
-          <w:rtl w:val="1"/>
-        </w:rPr>
-        <w:t xml:space="preserve">Test</w:t>
-      </w:r>
-      <w:r>
-        <w:rPr>
-          <w:rtl w:val="1"/>
-        </w:rPr>
-        <w:t xml:space="preserve">,</w:t>
-      </w:r>
-      <w:r>
-        <w:rPr>
-          <w:rtl w:val="1"/>
-        </w:rPr>
-        <w:t xml:space="preserve"> </w:t>
-      </w:r>
-      <w:r>
-        <w:rPr>
-          <w:rStyle w:val="VerbatimChar"/>
-          <w:rtl w:val="1"/>
-        </w:rPr>
-        <w:t xml:space="preserve">QuizResult</w:t>
-      </w:r>
-      <w:r>
-        <w:rPr>
-          <w:rtl w:val="1"/>
-        </w:rPr>
-        <w:t xml:space="preserve">,</w:t>
-      </w:r>
-      <w:r>
-        <w:rPr>
-          <w:rtl w:val="1"/>
-        </w:rPr>
-        <w:t xml:space="preserve"> </w:t>
-      </w:r>
-      <w:r>
-        <w:rPr>
-          <w:rStyle w:val="VerbatimChar"/>
-          <w:rtl w:val="1"/>
-        </w:rPr>
-        <w:t xml:space="preserve">NotificationPreferences</w:t>
-      </w:r>
-      <w:r>
-        <w:rPr>
-          <w:rtl w:val="1"/>
-        </w:rPr>
-        <w:t xml:space="preserve">.</w:t>
+        <w:t xml:space="preserve">סדר וארגון בקוד</w:t>
+      </w:r>
+      <w:r>
+        <w:rPr>
+          <w:rtl w:val="1"/>
+        </w:rPr>
+        <w:t xml:space="preserve"> </w:t>
+      </w:r>
+      <w:r>
+        <w:rPr>
+          <w:rtl w:val="1"/>
+        </w:rPr>
+        <w:t xml:space="preserve">– כל סוג לוגיקה במקום מוגדר.</w:t>
       </w:r>
     </w:p>
     <w:p>
@@ -13449,13 +13976,19 @@
           <w:bCs/>
           <w:rtl w:val="1"/>
         </w:rPr>
-        <w:t xml:space="preserve">שכבת העזר (Helpers):</w:t>
-      </w:r>
-      <w:r>
-        <w:rPr>
-          <w:rtl w:val="1"/>
-        </w:rPr>
-        <w:t xml:space="preserve"> </w:t>
+        <w:t xml:space="preserve">תחזוקה נוחה יותר</w:t>
+      </w:r>
+      <w:r>
+        <w:rPr>
+          <w:rtl w:val="1"/>
+        </w:rPr>
+        <w:t xml:space="preserve"> </w:t>
+      </w:r>
+      <w:r>
+        <w:rPr>
+          <w:rtl w:val="1"/>
+        </w:rPr>
+        <w:t xml:space="preserve">– שינויים במסד הנתונים מתבצעים במקום אחד (</w:t>
       </w:r>
       <w:r>
         <w:rPr>
@@ -13468,70 +14001,7 @@
         <w:rPr>
           <w:rtl w:val="1"/>
         </w:rPr>
-        <w:t xml:space="preserve">,</w:t>
-      </w:r>
-      <w:r>
-        <w:rPr>
-          <w:rtl w:val="1"/>
-        </w:rPr>
-        <w:t xml:space="preserve"> </w:t>
-      </w:r>
-      <w:r>
-        <w:rPr>
-          <w:rStyle w:val="VerbatimChar"/>
-          <w:rtl w:val="1"/>
-        </w:rPr>
-        <w:t xml:space="preserve">NotificationHelper</w:t>
-      </w:r>
-      <w:r>
-        <w:rPr>
-          <w:rtl w:val="1"/>
-        </w:rPr>
-        <w:t xml:space="preserve">,</w:t>
-      </w:r>
-      <w:r>
-        <w:rPr>
-          <w:rtl w:val="1"/>
-        </w:rPr>
-        <w:t xml:space="preserve"> </w:t>
-      </w:r>
-      <w:r>
-        <w:rPr>
-          <w:rStyle w:val="VerbatimChar"/>
-          <w:rtl w:val="1"/>
-        </w:rPr>
-        <w:t xml:space="preserve">FCMTokenManager</w:t>
-      </w:r>
-      <w:r>
-        <w:rPr>
-          <w:rtl w:val="1"/>
-        </w:rPr>
-        <w:t xml:space="preserve">,</w:t>
-      </w:r>
-      <w:r>
-        <w:rPr>
-          <w:rtl w:val="1"/>
-        </w:rPr>
-        <w:t xml:space="preserve"> </w:t>
-      </w:r>
-      <w:r>
-        <w:rPr>
-          <w:rStyle w:val="VerbatimChar"/>
-          <w:rtl w:val="1"/>
-        </w:rPr>
-        <w:t xml:space="preserve">WorkerScheduler</w:t>
-      </w:r>
-      <w:r>
-        <w:rPr>
-          <w:rtl w:val="1"/>
-        </w:rPr>
-        <w:t xml:space="preserve"> </w:t>
-      </w:r>
-      <w:r>
-        <w:rPr>
-          <w:rtl w:val="1"/>
-        </w:rPr>
-        <w:t xml:space="preserve">– מנתקות את ה-Activities מהפרטים הטכניים של Firebase.</w:t>
+        <w:t xml:space="preserve">).</w:t>
       </w:r>
     </w:p>
     <w:p>
@@ -13550,19 +14020,19 @@
           <w:bCs/>
           <w:rtl w:val="1"/>
         </w:rPr>
-        <w:t xml:space="preserve">ניהול הנתונים בענן:</w:t>
-      </w:r>
-      <w:r>
-        <w:rPr>
-          <w:rtl w:val="1"/>
-        </w:rPr>
-        <w:t xml:space="preserve"> </w:t>
-      </w:r>
-      <w:r>
-        <w:rPr>
-          <w:rtl w:val="1"/>
-        </w:rPr>
-        <w:t xml:space="preserve">Firebase Authentication + Firestore + FCM.</w:t>
+        <w:t xml:space="preserve">הפרדה בין תצוגה ללוגיקה</w:t>
+      </w:r>
+      <w:r>
+        <w:rPr>
+          <w:rtl w:val="1"/>
+        </w:rPr>
+        <w:t xml:space="preserve"> </w:t>
+      </w:r>
+      <w:r>
+        <w:rPr>
+          <w:rtl w:val="1"/>
+        </w:rPr>
+        <w:t xml:space="preserve">– המסכים אינם מבצעים פעולות ישירות מול Firestore.</w:t>
       </w:r>
     </w:p>
     <w:p>
@@ -13581,76 +14051,19 @@
           <w:bCs/>
           <w:rtl w:val="1"/>
         </w:rPr>
-        <w:t xml:space="preserve">משימות רקע:</w:t>
-      </w:r>
-      <w:r>
-        <w:rPr>
-          <w:rtl w:val="1"/>
-        </w:rPr>
-        <w:t xml:space="preserve"> </w:t>
-      </w:r>
-      <w:r>
-        <w:rPr>
-          <w:rStyle w:val="VerbatimChar"/>
-          <w:rtl w:val="1"/>
-        </w:rPr>
-        <w:t xml:space="preserve">WorkManager</w:t>
-      </w:r>
-      <w:r>
-        <w:rPr>
-          <w:rtl w:val="1"/>
-        </w:rPr>
-        <w:t xml:space="preserve"> </w:t>
-      </w:r>
-      <w:r>
-        <w:rPr>
-          <w:rtl w:val="1"/>
-        </w:rPr>
-        <w:t xml:space="preserve">עם</w:t>
-      </w:r>
-      <w:r>
-        <w:rPr>
-          <w:rtl w:val="1"/>
-        </w:rPr>
-        <w:t xml:space="preserve"> </w:t>
-      </w:r>
-      <w:r>
-        <w:rPr>
-          <w:rStyle w:val="VerbatimChar"/>
-          <w:rtl w:val="1"/>
-        </w:rPr>
-        <w:t xml:space="preserve">Workers</w:t>
-      </w:r>
-      <w:r>
-        <w:rPr>
-          <w:rtl w:val="1"/>
-        </w:rPr>
-        <w:t xml:space="preserve"> </w:t>
-      </w:r>
-      <w:r>
-        <w:rPr>
-          <w:rtl w:val="1"/>
-        </w:rPr>
-        <w:t xml:space="preserve">שונים, ו-</w:t>
-      </w:r>
-      <w:r>
-        <w:rPr>
-          <w:rStyle w:val="VerbatimChar"/>
-          <w:rtl w:val="1"/>
-        </w:rPr>
-        <w:t xml:space="preserve">BroadcastReceivers</w:t>
-      </w:r>
-      <w:r>
-        <w:rPr>
-          <w:rtl w:val="1"/>
-        </w:rPr>
-        <w:t xml:space="preserve"> </w:t>
-      </w:r>
-      <w:r>
-        <w:rPr>
-          <w:rtl w:val="1"/>
-        </w:rPr>
-        <w:t xml:space="preserve">לטיפול באירועי מערכת.</w:t>
+        <w:t xml:space="preserve">הוספת תכונות חדשות בעתיד</w:t>
+      </w:r>
+      <w:r>
+        <w:rPr>
+          <w:rtl w:val="1"/>
+        </w:rPr>
+        <w:t xml:space="preserve"> </w:t>
+      </w:r>
+      <w:r>
+        <w:rPr>
+          <w:rtl w:val="1"/>
+        </w:rPr>
+        <w:t xml:space="preserve">– ניתן להוסיף Activities, Workers ומודלים חדשים מבלי לשבור את המבנה הקיים.</w:t>
       </w:r>
     </w:p>
     <w:p>
@@ -13660,212 +14073,6 @@
         <w:numPr>
           <w:ilvl w:val="0"/>
           <w:numId w:val="1003"/>
-        </w:numPr>
-        <w:jc w:val="right"/>
-      </w:pPr>
-      <w:r>
-        <w:rPr>
-          <w:b/>
-          <w:bCs/>
-          <w:rtl w:val="1"/>
-        </w:rPr>
-        <w:t xml:space="preserve">חיבור בין הנתונים למסכים:</w:t>
-      </w:r>
-      <w:r>
-        <w:rPr>
-          <w:rtl w:val="1"/>
-        </w:rPr>
-        <w:t xml:space="preserve"> </w:t>
-      </w:r>
-      <w:r>
-        <w:rPr>
-          <w:rtl w:val="1"/>
-        </w:rPr>
-        <w:t xml:space="preserve">מחלקות</w:t>
-      </w:r>
-      <w:r>
-        <w:rPr>
-          <w:rtl w:val="1"/>
-        </w:rPr>
-        <w:t xml:space="preserve"> </w:t>
-      </w:r>
-      <w:r>
-        <w:rPr>
-          <w:rStyle w:val="VerbatimChar"/>
-          <w:rtl w:val="1"/>
-        </w:rPr>
-        <w:t xml:space="preserve">Adapter</w:t>
-      </w:r>
-      <w:r>
-        <w:rPr>
-          <w:rtl w:val="1"/>
-        </w:rPr>
-        <w:t xml:space="preserve"> </w:t>
-      </w:r>
-      <w:r>
-        <w:rPr>
-          <w:rtl w:val="1"/>
-        </w:rPr>
-        <w:t xml:space="preserve">פנימיות בכל מסך עם רשימה.</w:t>
-      </w:r>
-    </w:p>
-    <w:p>
-      <w:pPr>
-        <w:bidi w:val="1"/>
-        <w:pStyle w:val="FirstParagraph"/>
-        <w:jc w:val="right"/>
-      </w:pPr>
-      <w:r>
-        <w:rPr>
-          <w:rtl w:val="1"/>
-        </w:rPr>
-        <w:t xml:space="preserve">מבנה זה מאפשר:</w:t>
-      </w:r>
-    </w:p>
-    <w:p>
-      <w:pPr>
-        <w:bidi w:val="1"/>
-        <w:pStyle w:val="Compact"/>
-        <w:numPr>
-          <w:ilvl w:val="0"/>
-          <w:numId w:val="1004"/>
-        </w:numPr>
-        <w:jc w:val="right"/>
-      </w:pPr>
-      <w:r>
-        <w:rPr>
-          <w:b/>
-          <w:bCs/>
-          <w:rtl w:val="1"/>
-        </w:rPr>
-        <w:t xml:space="preserve">סדר וארגון בקוד</w:t>
-      </w:r>
-      <w:r>
-        <w:rPr>
-          <w:rtl w:val="1"/>
-        </w:rPr>
-        <w:t xml:space="preserve"> </w:t>
-      </w:r>
-      <w:r>
-        <w:rPr>
-          <w:rtl w:val="1"/>
-        </w:rPr>
-        <w:t xml:space="preserve">– כל סוג לוגיקה במקום מוגדר.</w:t>
-      </w:r>
-    </w:p>
-    <w:p>
-      <w:pPr>
-        <w:bidi w:val="1"/>
-        <w:pStyle w:val="Compact"/>
-        <w:numPr>
-          <w:ilvl w:val="0"/>
-          <w:numId w:val="1004"/>
-        </w:numPr>
-        <w:jc w:val="right"/>
-      </w:pPr>
-      <w:r>
-        <w:rPr>
-          <w:b/>
-          <w:bCs/>
-          <w:rtl w:val="1"/>
-        </w:rPr>
-        <w:t xml:space="preserve">תחזוקה נוחה יותר</w:t>
-      </w:r>
-      <w:r>
-        <w:rPr>
-          <w:rtl w:val="1"/>
-        </w:rPr>
-        <w:t xml:space="preserve"> </w:t>
-      </w:r>
-      <w:r>
-        <w:rPr>
-          <w:rtl w:val="1"/>
-        </w:rPr>
-        <w:t xml:space="preserve">– שינויים במסד הנתונים מתבצעים במקום אחד (</w:t>
-      </w:r>
-      <w:r>
-        <w:rPr>
-          <w:rStyle w:val="VerbatimChar"/>
-          <w:rtl w:val="1"/>
-        </w:rPr>
-        <w:t xml:space="preserve">FirestoreHelper</w:t>
-      </w:r>
-      <w:r>
-        <w:rPr>
-          <w:rtl w:val="1"/>
-        </w:rPr>
-        <w:t xml:space="preserve">).</w:t>
-      </w:r>
-    </w:p>
-    <w:p>
-      <w:pPr>
-        <w:bidi w:val="1"/>
-        <w:pStyle w:val="Compact"/>
-        <w:numPr>
-          <w:ilvl w:val="0"/>
-          <w:numId w:val="1004"/>
-        </w:numPr>
-        <w:jc w:val="right"/>
-      </w:pPr>
-      <w:r>
-        <w:rPr>
-          <w:b/>
-          <w:bCs/>
-          <w:rtl w:val="1"/>
-        </w:rPr>
-        <w:t xml:space="preserve">הפרדה בין תצוגה ללוגיקה</w:t>
-      </w:r>
-      <w:r>
-        <w:rPr>
-          <w:rtl w:val="1"/>
-        </w:rPr>
-        <w:t xml:space="preserve"> </w:t>
-      </w:r>
-      <w:r>
-        <w:rPr>
-          <w:rtl w:val="1"/>
-        </w:rPr>
-        <w:t xml:space="preserve">– המסכים אינם מבצעים פעולות ישירות מול Firestore.</w:t>
-      </w:r>
-    </w:p>
-    <w:p>
-      <w:pPr>
-        <w:bidi w:val="1"/>
-        <w:pStyle w:val="Compact"/>
-        <w:numPr>
-          <w:ilvl w:val="0"/>
-          <w:numId w:val="1004"/>
-        </w:numPr>
-        <w:jc w:val="right"/>
-      </w:pPr>
-      <w:r>
-        <w:rPr>
-          <w:b/>
-          <w:bCs/>
-          <w:rtl w:val="1"/>
-        </w:rPr>
-        <w:t xml:space="preserve">הוספת תכונות חדשות בעתיד</w:t>
-      </w:r>
-      <w:r>
-        <w:rPr>
-          <w:rtl w:val="1"/>
-        </w:rPr>
-        <w:t xml:space="preserve"> </w:t>
-      </w:r>
-      <w:r>
-        <w:rPr>
-          <w:rtl w:val="1"/>
-        </w:rPr>
-        <w:t xml:space="preserve">– ניתן להוסיף Activities, Workers ומודלים חדשים מבלי לשבור את המבנה הקיים.</w:t>
-      </w:r>
-    </w:p>
-    <w:p>
-      <w:pPr>
-        <w:bidi w:val="1"/>
-        <w:pStyle w:val="Compact"/>
-        <w:numPr>
-          <w:ilvl w:val="0"/>
-          <w:numId w:val="1004"/>
         </w:numPr>
         <w:jc w:val="right"/>
       </w:pPr>
@@ -14115,9 +14322,6 @@
     <w:abstractNumId w:val="991"/>
   </w:num>
   <w:num w:numId="1003">
-    <w:abstractNumId w:val="991"/>
-  </w:num>
-  <w:num w:numId="1004">
     <w:abstractNumId w:val="991"/>
   </w:num>
 </w:numbering>

</xml_diff>

<commit_message>
Fix full RTL alignment: apply bidi/right-align to styles and docDefaults
Previous version only patched individual paragraphs; Word's built-in
styles (Normal, Heading 1-6, etc.) were overriding those settings.
Now patches: w:docDefaults pPr/rPr, all named styles, and every
paragraph/run in body and tables.

Co-Authored-By: Claude Sonnet 4.6 (1M context) <noreply@anthropic.com>
</commit_message>
<xml_diff>
--- a/docs/screens-and-architecture-he.docx
+++ b/docs/screens-and-architecture-he.docx
@@ -14336,11 +14336,14 @@
         <w:sz w:val="24"/>
         <w:szCs w:val="24"/>
         <w:lang w:bidi="ar-SA" w:eastAsia="zh-CN" w:val="en-US"/>
+        <w:rtl w:val="1"/>
       </w:rPr>
     </w:rPrDefault>
     <w:pPrDefault>
       <w:pPr>
+        <w:bidi w:val="1"/>
         <w:spacing w:after="200"/>
+        <w:jc w:val="right"/>
       </w:pPr>
     </w:pPrDefault>
   </w:docDefaults>
@@ -14355,7 +14358,9 @@
     <w:link w:val="BodyTextChar"/>
     <w:qFormat/>
     <w:pPr>
+      <w:bidi w:val="1"/>
       <w:spacing w:after="180" w:before="180"/>
+      <w:jc w:val="right"/>
     </w:pPr>
   </w:style>
   <w:style w:customStyle="1" w:styleId="FirstParagraph" w:type="paragraph">
@@ -14369,7 +14374,9 @@
     <w:basedOn w:val="BodyText"/>
     <w:qFormat/>
     <w:pPr>
+      <w:bidi w:val="1"/>
       <w:spacing w:after="36" w:before="36"/>
+      <w:jc w:val="right"/>
     </w:pPr>
   </w:style>
   <w:style w:styleId="Title" w:type="paragraph">
@@ -14381,14 +14388,16 @@
     <w:qFormat/>
     <w:rsid w:val="00A10FD9"/>
     <w:pPr>
+      <w:bidi w:val="1"/>
       <w:spacing w:after="80" w:line="240" w:lineRule="auto"/>
       <w:contextualSpacing/>
-      <w:jc w:val="center"/>
+      <w:jc w:val="right"/>
     </w:pPr>
     <w:rPr>
       <w:rFonts w:asciiTheme="majorHAnsi" w:cstheme="majorBidi" w:eastAsiaTheme="majorEastAsia" w:hAnsiTheme="majorHAnsi"/>
       <w:sz w:val="56"/>
       <w:szCs w:val="56"/>
+      <w:rtl w:val="1"/>
     </w:rPr>
   </w:style>
   <w:style w:customStyle="1" w:styleId="TitleChar" w:type="character">
@@ -14401,6 +14410,7 @@
       <w:rFonts w:asciiTheme="majorHAnsi" w:cstheme="majorBidi" w:eastAsiaTheme="majorEastAsia" w:hAnsiTheme="majorHAnsi"/>
       <w:sz w:val="56"/>
       <w:szCs w:val="56"/>
+      <w:rtl w:val="1"/>
     </w:rPr>
   </w:style>
   <w:style w:styleId="Subtitle" w:type="paragraph">
@@ -14412,15 +14422,18 @@
     <w:qFormat/>
     <w:rsid w:val="00A10FD9"/>
     <w:pPr>
+      <w:bidi w:val="1"/>
       <w:numPr>
         <w:ilvl w:val="1"/>
       </w:numPr>
+      <w:jc w:val="right"/>
     </w:pPr>
     <w:rPr>
       <w:rFonts w:cstheme="majorBidi" w:eastAsiaTheme="majorEastAsia"/>
       <w:spacing w:val="15"/>
       <w:sz w:val="28"/>
       <w:szCs w:val="28"/>
+      <w:rtl w:val="1"/>
     </w:rPr>
   </w:style>
   <w:style w:customStyle="1" w:styleId="SubtitleChar" w:type="character">
@@ -14435,6 +14448,7 @@
       <w:spacing w:val="15"/>
       <w:sz w:val="28"/>
       <w:szCs w:val="28"/>
+      <w:rtl w:val="1"/>
     </w:rPr>
   </w:style>
   <w:style w:customStyle="1" w:styleId="Author" w:type="paragraph">
@@ -14443,12 +14457,15 @@
     <w:next w:val="BodyText"/>
     <w:qFormat/>
     <w:pPr>
+      <w:bidi w:val="1"/>
       <w:keepNext/>
       <w:keepLines/>
+      <w:jc w:val="right"/>
     </w:pPr>
     <w:rPr>
       <w:sz w:val="24"/>
       <w:szCs w:val="24"/>
+      <w:rtl w:val="1"/>
     </w:rPr>
   </w:style>
   <w:style w:styleId="Date" w:type="paragraph">
@@ -14457,12 +14474,15 @@
     <w:next w:val="BodyText"/>
     <w:qFormat/>
     <w:pPr>
+      <w:bidi w:val="1"/>
       <w:keepNext/>
       <w:keepLines/>
+      <w:jc w:val="right"/>
     </w:pPr>
     <w:rPr>
       <w:sz w:val="24"/>
       <w:szCs w:val="24"/>
+      <w:rtl w:val="1"/>
     </w:rPr>
   </w:style>
   <w:style w:customStyle="1" w:styleId="AbstractTitle" w:type="paragraph">
@@ -14471,15 +14491,17 @@
     <w:next w:val="Abstract"/>
     <w:qFormat/>
     <w:pPr>
+      <w:bidi w:val="1"/>
       <w:keepNext/>
       <w:keepLines/>
       <w:spacing w:after="0" w:before="300"/>
-      <w:jc w:val="center"/>
+      <w:jc w:val="right"/>
     </w:pPr>
     <w:rPr>
       <w:b/>
       <w:sz w:val="20"/>
       <w:szCs w:val="20"/>
+      <w:rtl w:val="1"/>
     </w:rPr>
   </w:style>
   <w:style w:customStyle="1" w:styleId="Abstract" w:type="paragraph">
@@ -14488,13 +14510,16 @@
     <w:next w:val="BodyText"/>
     <w:qFormat/>
     <w:pPr>
+      <w:bidi w:val="1"/>
       <w:keepNext/>
       <w:keepLines/>
       <w:spacing w:after="300" w:before="100"/>
+      <w:jc w:val="right"/>
     </w:pPr>
     <w:rPr>
       <w:sz w:val="20"/>
       <w:szCs w:val="20"/>
+      <w:rtl w:val="1"/>
     </w:rPr>
   </w:style>
   <w:style w:styleId="Bibliography" w:type="paragraph">
@@ -14502,8 +14527,13 @@
     <w:basedOn w:val="Normal"/>
     <w:next w:val="Bibliography"/>
     <w:qFormat/>
-    <w:pPr/>
-    <w:rPr/>
+    <w:pPr>
+      <w:bidi w:val="1"/>
+      <w:jc w:val="right"/>
+    </w:pPr>
+    <w:rPr>
+      <w:rtl w:val="1"/>
+    </w:rPr>
   </w:style>
   <w:style w:styleId="Heading1" w:type="paragraph">
     <w:name w:val="heading 1"/>
@@ -14514,16 +14544,19 @@
     <w:qFormat/>
     <w:rsid w:val="00A10FD9"/>
     <w:pPr>
+      <w:bidi w:val="1"/>
       <w:keepNext/>
       <w:keepLines/>
       <w:spacing w:after="80" w:before="360"/>
       <w:outlineLvl w:val="0"/>
+      <w:jc w:val="right"/>
     </w:pPr>
     <w:rPr>
       <w:rFonts w:asciiTheme="majorHAnsi" w:cstheme="majorBidi" w:eastAsiaTheme="majorEastAsia" w:hAnsiTheme="majorHAnsi"/>
       <w:color w:themeColor="accent1" w:themeShade="BF" w:val="0F4761"/>
       <w:sz w:val="40"/>
       <w:szCs w:val="40"/>
+      <w:rtl w:val="1"/>
     </w:rPr>
   </w:style>
   <w:style w:styleId="Heading2" w:type="paragraph">
@@ -14537,16 +14570,19 @@
     <w:qFormat/>
     <w:rsid w:val="00A10FD9"/>
     <w:pPr>
+      <w:bidi w:val="1"/>
       <w:keepNext/>
       <w:keepLines/>
       <w:spacing w:after="80" w:before="160"/>
       <w:outlineLvl w:val="1"/>
+      <w:jc w:val="right"/>
     </w:pPr>
     <w:rPr>
       <w:rFonts w:asciiTheme="majorHAnsi" w:cstheme="majorBidi" w:eastAsiaTheme="majorEastAsia" w:hAnsiTheme="majorHAnsi"/>
       <w:color w:themeColor="accent1" w:themeShade="BF" w:val="0F4761"/>
       <w:sz w:val="32"/>
       <w:szCs w:val="32"/>
+      <w:rtl w:val="1"/>
     </w:rPr>
   </w:style>
   <w:style w:styleId="Heading3" w:type="paragraph">
@@ -14560,16 +14596,19 @@
     <w:qFormat/>
     <w:rsid w:val="00A10FD9"/>
     <w:pPr>
+      <w:bidi w:val="1"/>
       <w:keepNext/>
       <w:keepLines/>
       <w:spacing w:after="80" w:before="160"/>
       <w:outlineLvl w:val="2"/>
+      <w:jc w:val="right"/>
     </w:pPr>
     <w:rPr>
       <w:rFonts w:cstheme="majorBidi" w:eastAsiaTheme="majorEastAsia"/>
       <w:color w:themeColor="accent1" w:themeShade="BF" w:val="0F4761"/>
       <w:sz w:val="28"/>
       <w:szCs w:val="28"/>
+      <w:rtl w:val="1"/>
     </w:rPr>
   </w:style>
   <w:style w:styleId="Heading4" w:type="paragraph">
@@ -14583,16 +14622,19 @@
     <w:qFormat/>
     <w:rsid w:val="00A10FD9"/>
     <w:pPr>
+      <w:bidi w:val="1"/>
       <w:keepNext/>
       <w:keepLines/>
       <w:spacing w:after="40" w:before="80"/>
       <w:outlineLvl w:val="3"/>
+      <w:jc w:val="right"/>
     </w:pPr>
     <w:rPr>
       <w:rFonts w:cstheme="majorBidi" w:eastAsiaTheme="majorEastAsia"/>
       <w:i/>
       <w:iCs/>
       <w:color w:themeColor="accent1" w:themeShade="BF" w:val="0F4761"/>
+      <w:rtl w:val="1"/>
     </w:rPr>
   </w:style>
   <w:style w:styleId="Heading5" w:type="paragraph">
@@ -14606,14 +14648,17 @@
     <w:qFormat/>
     <w:rsid w:val="00A10FD9"/>
     <w:pPr>
+      <w:bidi w:val="1"/>
       <w:keepNext/>
       <w:keepLines/>
       <w:spacing w:after="40" w:before="80"/>
       <w:outlineLvl w:val="4"/>
+      <w:jc w:val="right"/>
     </w:pPr>
     <w:rPr>
       <w:rFonts w:cstheme="majorBidi" w:eastAsiaTheme="majorEastAsia"/>
       <w:color w:themeColor="accent1" w:themeShade="BF" w:val="0F4761"/>
+      <w:rtl w:val="1"/>
     </w:rPr>
   </w:style>
   <w:style w:styleId="Heading6" w:type="paragraph">
@@ -14627,16 +14672,19 @@
     <w:qFormat/>
     <w:rsid w:val="00A10FD9"/>
     <w:pPr>
+      <w:bidi w:val="1"/>
       <w:keepNext/>
       <w:keepLines/>
       <w:spacing w:after="0" w:before="40"/>
       <w:outlineLvl w:val="5"/>
+      <w:jc w:val="right"/>
     </w:pPr>
     <w:rPr>
       <w:rFonts w:cstheme="majorBidi" w:eastAsiaTheme="majorEastAsia"/>
       <w:i/>
       <w:iCs/>
       <w:color w:themeColor="text1" w:themeTint="A6" w:val="595959"/>
+      <w:rtl w:val="1"/>
     </w:rPr>
   </w:style>
   <w:style w:styleId="Heading7" w:type="paragraph">
@@ -14650,14 +14698,17 @@
     <w:qFormat/>
     <w:rsid w:val="00A10FD9"/>
     <w:pPr>
+      <w:bidi w:val="1"/>
       <w:keepNext/>
       <w:keepLines/>
       <w:spacing w:after="0" w:before="40"/>
       <w:outlineLvl w:val="6"/>
+      <w:jc w:val="right"/>
     </w:pPr>
     <w:rPr>
       <w:rFonts w:cstheme="majorBidi" w:eastAsiaTheme="majorEastAsia"/>
       <w:color w:themeColor="text1" w:themeTint="A6" w:val="595959"/>
+      <w:rtl w:val="1"/>
     </w:rPr>
   </w:style>
   <w:style w:styleId="Heading8" w:type="paragraph">
@@ -14671,16 +14722,19 @@
     <w:qFormat/>
     <w:rsid w:val="00A10FD9"/>
     <w:pPr>
+      <w:bidi w:val="1"/>
       <w:keepNext/>
       <w:keepLines/>
       <w:spacing w:after="0"/>
       <w:outlineLvl w:val="7"/>
+      <w:jc w:val="right"/>
     </w:pPr>
     <w:rPr>
       <w:rFonts w:cstheme="majorBidi" w:eastAsiaTheme="majorEastAsia"/>
       <w:i/>
       <w:iCs/>
       <w:color w:themeColor="text1" w:themeTint="D8" w:val="272727"/>
+      <w:rtl w:val="1"/>
     </w:rPr>
   </w:style>
   <w:style w:styleId="Heading9" w:type="paragraph">
@@ -14694,14 +14748,17 @@
     <w:qFormat/>
     <w:rsid w:val="00A10FD9"/>
     <w:pPr>
+      <w:bidi w:val="1"/>
       <w:keepNext/>
       <w:keepLines/>
       <w:spacing w:after="0"/>
       <w:outlineLvl w:val="8"/>
+      <w:jc w:val="right"/>
     </w:pPr>
     <w:rPr>
       <w:rFonts w:cstheme="majorBidi" w:eastAsiaTheme="majorEastAsia"/>
       <w:color w:themeColor="text1" w:themeTint="D8" w:val="272727"/>
+      <w:rtl w:val="1"/>
     </w:rPr>
   </w:style>
   <w:style w:customStyle="1" w:styleId="Heading1Char" w:type="character">
@@ -14715,6 +14772,7 @@
       <w:color w:themeColor="accent1" w:themeShade="BF" w:val="0F4761"/>
       <w:sz w:val="40"/>
       <w:szCs w:val="40"/>
+      <w:rtl w:val="1"/>
     </w:rPr>
   </w:style>
   <w:style w:customStyle="1" w:styleId="Heading2Char" w:type="character">
@@ -14729,6 +14787,7 @@
       <w:color w:themeColor="accent1" w:themeShade="BF" w:val="0F4761"/>
       <w:sz w:val="32"/>
       <w:szCs w:val="32"/>
+      <w:rtl w:val="1"/>
     </w:rPr>
   </w:style>
   <w:style w:customStyle="1" w:styleId="Heading3Char" w:type="character">
@@ -14743,6 +14802,7 @@
       <w:color w:themeColor="accent1" w:themeShade="BF" w:val="0F4761"/>
       <w:sz w:val="28"/>
       <w:szCs w:val="28"/>
+      <w:rtl w:val="1"/>
     </w:rPr>
   </w:style>
   <w:style w:customStyle="1" w:styleId="Heading4Char" w:type="character">
@@ -14757,6 +14817,7 @@
       <w:i/>
       <w:iCs/>
       <w:color w:themeColor="accent1" w:themeShade="BF" w:val="0F4761"/>
+      <w:rtl w:val="1"/>
     </w:rPr>
   </w:style>
   <w:style w:customStyle="1" w:styleId="Heading5Char" w:type="character">
@@ -14769,6 +14830,7 @@
     <w:rPr>
       <w:rFonts w:cstheme="majorBidi" w:eastAsiaTheme="majorEastAsia"/>
       <w:color w:themeColor="accent1" w:themeShade="BF" w:val="0F4761"/>
+      <w:rtl w:val="1"/>
     </w:rPr>
   </w:style>
   <w:style w:customStyle="1" w:styleId="Heading6Char" w:type="character">
@@ -14783,6 +14845,7 @@
       <w:i/>
       <w:iCs/>
       <w:color w:themeColor="text1" w:themeTint="A6" w:val="595959"/>
+      <w:rtl w:val="1"/>
     </w:rPr>
   </w:style>
   <w:style w:customStyle="1" w:styleId="Heading7Char" w:type="character">
@@ -14795,6 +14858,7 @@
     <w:rPr>
       <w:rFonts w:cstheme="majorBidi" w:eastAsiaTheme="majorEastAsia"/>
       <w:color w:themeColor="text1" w:themeTint="A6" w:val="595959"/>
+      <w:rtl w:val="1"/>
     </w:rPr>
   </w:style>
   <w:style w:customStyle="1" w:styleId="Heading8Char" w:type="character">
@@ -14809,6 +14873,7 @@
       <w:i/>
       <w:iCs/>
       <w:color w:themeColor="text1" w:themeTint="D8" w:val="272727"/>
+      <w:rtl w:val="1"/>
     </w:rPr>
   </w:style>
   <w:style w:customStyle="1" w:styleId="Heading9Char" w:type="character">
@@ -14821,6 +14886,7 @@
     <w:rPr>
       <w:rFonts w:cstheme="majorBidi" w:eastAsiaTheme="majorEastAsia"/>
       <w:color w:themeColor="text1" w:themeTint="D8" w:val="272727"/>
+      <w:rtl w:val="1"/>
     </w:rPr>
   </w:style>
   <w:style w:styleId="BlockText" w:type="paragraph">
@@ -14831,8 +14897,10 @@
     <w:unhideWhenUsed/>
     <w:qFormat/>
     <w:pPr>
+      <w:bidi w:val="1"/>
       <w:spacing w:after="100" w:before="100"/>
       <w:ind w:firstLine="0" w:left="480" w:right="480"/>
+      <w:jc w:val="right"/>
     </w:pPr>
   </w:style>
   <w:style w:styleId="FootnoteText" w:type="paragraph">
@@ -14851,8 +14919,10 @@
     <w:unhideWhenUsed/>
     <w:qFormat/>
     <w:pPr>
+      <w:bidi w:val="1"/>
       <w:spacing w:after="100" w:before="100"/>
       <w:ind w:firstLine="0" w:left="480" w:right="480"/>
+      <w:jc w:val="right"/>
     </w:pPr>
   </w:style>
   <w:style w:default="1" w:styleId="DefaultParagraphFont" w:type="character">
@@ -14889,12 +14959,15 @@
     <w:basedOn w:val="Normal"/>
     <w:next w:val="Definition"/>
     <w:pPr>
+      <w:bidi w:val="1"/>
       <w:keepNext/>
       <w:keepLines/>
       <w:spacing w:after="0"/>
+      <w:jc w:val="right"/>
     </w:pPr>
     <w:rPr>
       <w:b/>
+      <w:rtl w:val="1"/>
     </w:rPr>
   </w:style>
   <w:style w:customStyle="1" w:styleId="Definition" w:type="paragraph">
@@ -14906,17 +14979,22 @@
     <w:basedOn w:val="Normal"/>
     <w:link w:val="BodyTextChar"/>
     <w:pPr>
+      <w:bidi w:val="1"/>
       <w:spacing w:after="120" w:before="0"/>
+      <w:jc w:val="right"/>
     </w:pPr>
     <w:rPr>
       <w:i/>
+      <w:rtl w:val="1"/>
     </w:rPr>
   </w:style>
   <w:style w:customStyle="1" w:styleId="TableCaption" w:type="paragraph">
     <w:name w:val="Table Caption"/>
     <w:basedOn w:val="Caption"/>
     <w:pPr>
+      <w:bidi w:val="1"/>
       <w:keepNext/>
+      <w:jc w:val="right"/>
     </w:pPr>
   </w:style>
   <w:style w:customStyle="1" w:styleId="ImageCaption" w:type="paragraph">
@@ -14931,7 +15009,9 @@
     <w:name w:val="Captioned Figure"/>
     <w:basedOn w:val="Figure"/>
     <w:pPr>
+      <w:bidi w:val="1"/>
       <w:keepNext/>
+      <w:jc w:val="right"/>
     </w:pPr>
   </w:style>
   <w:style w:customStyle="1" w:styleId="BodyTextChar" w:type="character">
@@ -14945,6 +15025,7 @@
     <w:rPr>
       <w:rFonts w:ascii="Consolas" w:hAnsi="Consolas"/>
       <w:sz w:val="22"/>
+      <w:rtl w:val="1"/>
     </w:rPr>
   </w:style>
   <w:style w:customStyle="1" w:styleId="SectionNumber" w:type="character">
@@ -14956,6 +15037,7 @@
     <w:basedOn w:val="BodyTextChar"/>
     <w:rPr>
       <w:vertAlign w:val="superscript"/>
+      <w:rtl w:val="1"/>
     </w:rPr>
   </w:style>
   <w:style w:styleId="Hyperlink" w:type="character">
@@ -14963,6 +15045,7 @@
     <w:basedOn w:val="BodyTextChar"/>
     <w:rPr>
       <w:color w:themeColor="accent1" w:val="4F81BD"/>
+      <w:rtl w:val="1"/>
     </w:rPr>
   </w:style>
   <w:style w:styleId="TOCHeading" w:type="paragraph">
@@ -14973,14 +15056,17 @@
     <w:unhideWhenUsed/>
     <w:qFormat/>
     <w:pPr>
+      <w:bidi w:val="1"/>
       <w:spacing w:before="240" w:line="259" w:lineRule="auto"/>
       <w:outlineLvl w:val="9"/>
+      <w:jc w:val="right"/>
     </w:pPr>
     <w:rPr>
       <w:rFonts w:asciiTheme="majorHAnsi" w:cstheme="majorBidi" w:eastAsiaTheme="majorEastAsia" w:hAnsiTheme="majorHAnsi"/>
       <w:b w:val="0"/>
       <w:bCs w:val="0"/>
       <w:color w:themeColor="accent1" w:themeShade="BF" w:val="365F91"/>
+      <w:rtl w:val="1"/>
     </w:rPr>
   </w:style>
   <w:style w:customStyle="1" w:styleId="SourceCode" w:type="paragraph">
@@ -14988,7 +15074,9 @@
     <w:basedOn w:val="Normal"/>
     <w:link w:val="VerbatimChar"/>
     <w:pPr>
+      <w:bidi w:val="1"/>
       <w:wordWrap w:val="off"/>
+      <w:jc w:val="right"/>
     </w:pPr>
   </w:style>
   <w:style w:customStyle="1" w:styleId="KeywordTok" w:type="character">
@@ -14997,6 +15085,7 @@
     <w:rPr>
       <w:b/>
       <w:color w:val="007020"/>
+      <w:rtl w:val="1"/>
     </w:rPr>
   </w:style>
   <w:style w:customStyle="1" w:styleId="DataTypeTok" w:type="character">
@@ -15004,6 +15093,7 @@
     <w:basedOn w:val="VerbatimChar"/>
     <w:rPr>
       <w:color w:val="902000"/>
+      <w:rtl w:val="1"/>
     </w:rPr>
   </w:style>
   <w:style w:customStyle="1" w:styleId="DecValTok" w:type="character">
@@ -15011,6 +15101,7 @@
     <w:basedOn w:val="VerbatimChar"/>
     <w:rPr>
       <w:color w:val="40a070"/>
+      <w:rtl w:val="1"/>
     </w:rPr>
   </w:style>
   <w:style w:customStyle="1" w:styleId="BaseNTok" w:type="character">
@@ -15018,6 +15109,7 @@
     <w:basedOn w:val="VerbatimChar"/>
     <w:rPr>
       <w:color w:val="40a070"/>
+      <w:rtl w:val="1"/>
     </w:rPr>
   </w:style>
   <w:style w:customStyle="1" w:styleId="FloatTok" w:type="character">
@@ -15025,6 +15117,7 @@
     <w:basedOn w:val="VerbatimChar"/>
     <w:rPr>
       <w:color w:val="40a070"/>
+      <w:rtl w:val="1"/>
     </w:rPr>
   </w:style>
   <w:style w:customStyle="1" w:styleId="ConstantTok" w:type="character">
@@ -15032,6 +15125,7 @@
     <w:basedOn w:val="VerbatimChar"/>
     <w:rPr>
       <w:color w:val="880000"/>
+      <w:rtl w:val="1"/>
     </w:rPr>
   </w:style>
   <w:style w:customStyle="1" w:styleId="CharTok" w:type="character">
@@ -15039,6 +15133,7 @@
     <w:basedOn w:val="VerbatimChar"/>
     <w:rPr>
       <w:color w:val="4070a0"/>
+      <w:rtl w:val="1"/>
     </w:rPr>
   </w:style>
   <w:style w:customStyle="1" w:styleId="SpecialCharTok" w:type="character">
@@ -15046,6 +15141,7 @@
     <w:basedOn w:val="VerbatimChar"/>
     <w:rPr>
       <w:color w:val="4070a0"/>
+      <w:rtl w:val="1"/>
     </w:rPr>
   </w:style>
   <w:style w:customStyle="1" w:styleId="StringTok" w:type="character">
@@ -15053,6 +15149,7 @@
     <w:basedOn w:val="VerbatimChar"/>
     <w:rPr>
       <w:color w:val="4070a0"/>
+      <w:rtl w:val="1"/>
     </w:rPr>
   </w:style>
   <w:style w:customStyle="1" w:styleId="VerbatimStringTok" w:type="character">
@@ -15060,6 +15157,7 @@
     <w:basedOn w:val="VerbatimChar"/>
     <w:rPr>
       <w:color w:val="4070a0"/>
+      <w:rtl w:val="1"/>
     </w:rPr>
   </w:style>
   <w:style w:customStyle="1" w:styleId="SpecialStringTok" w:type="character">
@@ -15067,6 +15165,7 @@
     <w:basedOn w:val="VerbatimChar"/>
     <w:rPr>
       <w:color w:val="bb6688"/>
+      <w:rtl w:val="1"/>
     </w:rPr>
   </w:style>
   <w:style w:customStyle="1" w:styleId="ImportTok" w:type="character">
@@ -15075,6 +15174,7 @@
     <w:rPr>
       <w:b/>
       <w:color w:val="008000"/>
+      <w:rtl w:val="1"/>
     </w:rPr>
   </w:style>
   <w:style w:customStyle="1" w:styleId="CommentTok" w:type="character">
@@ -15083,6 +15183,7 @@
     <w:rPr>
       <w:i/>
       <w:color w:val="60a0b0"/>
+      <w:rtl w:val="1"/>
     </w:rPr>
   </w:style>
   <w:style w:customStyle="1" w:styleId="DocumentationTok" w:type="character">
@@ -15091,6 +15192,7 @@
     <w:rPr>
       <w:i/>
       <w:color w:val="ba2121"/>
+      <w:rtl w:val="1"/>
     </w:rPr>
   </w:style>
   <w:style w:customStyle="1" w:styleId="AnnotationTok" w:type="character">
@@ -15100,6 +15202,7 @@
       <w:b/>
       <w:i/>
       <w:color w:val="60a0b0"/>
+      <w:rtl w:val="1"/>
     </w:rPr>
   </w:style>
   <w:style w:customStyle="1" w:styleId="CommentVarTok" w:type="character">
@@ -15109,6 +15212,7 @@
       <w:b/>
       <w:i/>
       <w:color w:val="60a0b0"/>
+      <w:rtl w:val="1"/>
     </w:rPr>
   </w:style>
   <w:style w:customStyle="1" w:styleId="OtherTok" w:type="character">
@@ -15116,6 +15220,7 @@
     <w:basedOn w:val="VerbatimChar"/>
     <w:rPr>
       <w:color w:val="007020"/>
+      <w:rtl w:val="1"/>
     </w:rPr>
   </w:style>
   <w:style w:customStyle="1" w:styleId="FunctionTok" w:type="character">
@@ -15123,6 +15228,7 @@
     <w:basedOn w:val="VerbatimChar"/>
     <w:rPr>
       <w:color w:val="06287e"/>
+      <w:rtl w:val="1"/>
     </w:rPr>
   </w:style>
   <w:style w:customStyle="1" w:styleId="VariableTok" w:type="character">
@@ -15130,6 +15236,7 @@
     <w:basedOn w:val="VerbatimChar"/>
     <w:rPr>
       <w:color w:val="19177c"/>
+      <w:rtl w:val="1"/>
     </w:rPr>
   </w:style>
   <w:style w:customStyle="1" w:styleId="ControlFlowTok" w:type="character">
@@ -15138,6 +15245,7 @@
     <w:rPr>
       <w:b/>
       <w:color w:val="007020"/>
+      <w:rtl w:val="1"/>
     </w:rPr>
   </w:style>
   <w:style w:customStyle="1" w:styleId="OperatorTok" w:type="character">
@@ -15145,6 +15253,7 @@
     <w:basedOn w:val="VerbatimChar"/>
     <w:rPr>
       <w:color w:val="666666"/>
+      <w:rtl w:val="1"/>
     </w:rPr>
   </w:style>
   <w:style w:customStyle="1" w:styleId="BuiltInTok" w:type="character">
@@ -15152,18 +15261,22 @@
     <w:basedOn w:val="VerbatimChar"/>
     <w:rPr>
       <w:color w:val="008000"/>
+      <w:rtl w:val="1"/>
     </w:rPr>
   </w:style>
   <w:style w:customStyle="1" w:styleId="ExtensionTok" w:type="character">
     <w:name w:val="ExtensionTok"/>
     <w:basedOn w:val="VerbatimChar"/>
-    <w:rPr/>
+    <w:rPr>
+      <w:rtl w:val="1"/>
+    </w:rPr>
   </w:style>
   <w:style w:customStyle="1" w:styleId="PreprocessorTok" w:type="character">
     <w:name w:val="PreprocessorTok"/>
     <w:basedOn w:val="VerbatimChar"/>
     <w:rPr>
       <w:color w:val="bc7a00"/>
+      <w:rtl w:val="1"/>
     </w:rPr>
   </w:style>
   <w:style w:customStyle="1" w:styleId="AttributeTok" w:type="character">
@@ -15171,12 +15284,15 @@
     <w:basedOn w:val="VerbatimChar"/>
     <w:rPr>
       <w:color w:val="7d9029"/>
+      <w:rtl w:val="1"/>
     </w:rPr>
   </w:style>
   <w:style w:customStyle="1" w:styleId="RegionMarkerTok" w:type="character">
     <w:name w:val="RegionMarkerTok"/>
     <w:basedOn w:val="VerbatimChar"/>
-    <w:rPr/>
+    <w:rPr>
+      <w:rtl w:val="1"/>
+    </w:rPr>
   </w:style>
   <w:style w:customStyle="1" w:styleId="InformationTok" w:type="character">
     <w:name w:val="InformationTok"/>
@@ -15185,6 +15301,7 @@
       <w:b/>
       <w:i/>
       <w:color w:val="60a0b0"/>
+      <w:rtl w:val="1"/>
     </w:rPr>
   </w:style>
   <w:style w:customStyle="1" w:styleId="WarningTok" w:type="character">
@@ -15194,6 +15311,7 @@
       <w:b/>
       <w:i/>
       <w:color w:val="60a0b0"/>
+      <w:rtl w:val="1"/>
     </w:rPr>
   </w:style>
   <w:style w:customStyle="1" w:styleId="AlertTok" w:type="character">
@@ -15202,6 +15320,7 @@
     <w:rPr>
       <w:b/>
       <w:color w:val="ff0000"/>
+      <w:rtl w:val="1"/>
     </w:rPr>
   </w:style>
   <w:style w:customStyle="1" w:styleId="ErrorTok" w:type="character">
@@ -15210,12 +15329,15 @@
     <w:rPr>
       <w:b/>
       <w:color w:val="ff0000"/>
+      <w:rtl w:val="1"/>
     </w:rPr>
   </w:style>
   <w:style w:customStyle="1" w:styleId="NormalTok" w:type="character">
     <w:name w:val="NormalTok"/>
     <w:basedOn w:val="VerbatimChar"/>
-    <w:rPr/>
+    <w:rPr>
+      <w:rtl w:val="1"/>
+    </w:rPr>
   </w:style>
 </w:styles>
 </file>

</xml_diff>